<commit_message>
Recette : double authentification suspendue pendant les tests
Guide des testeurs à jour (premier mot de passe seulement) ; état du projet : paramètre
à rétablir en fin de tests, production inchangée.

Co-Authored-By: Claude Opus 5.5 <noreply@anthropic.com>
</commit_message>
<xml_diff>
--- a/docs/projet/Guide_des_testeurs.docx
+++ b/docs/projet/Guide_des_testeurs.docx
@@ -181,36 +181,7 @@
           <w:sz w:val="20"/>
           <w:szCs w:val="20"/>
         </w:rPr>
-        <w:t xml:space="preserve">Double authentification : installez sur votre téléphone Google Authenticator ou Microsoft Authenticator, touchez « + », scannez le code affiché à l'écran, puis tapez le code à 6 chiffres que l'application affiche. Ensuite, à chaque connexion, le code de l'application vous sera demandé.</w:t>
-      </w:r>
-    </w:p>
-    <w:p>
-      <w:pPr>
-        <w:tabs>
-          <w:tab w:val="left" w:pos="360"/>
-        </w:tabs>
-        <w:spacing w:after="60"/>
-        <w:ind w:left="360" w:hanging="360"/>
-        <w:jc w:val="both"/>
-      </w:pPr>
-      <w:r>
-        <w:rPr>
-          <w:rFonts w:ascii="Calibri" w:cs="Calibri" w:eastAsia="Calibri" w:hAnsi="Calibri"/>
-          <w:b/>
-          <w:bCs/>
-          <w:color w:val="1A9E9E"/>
-          <w:sz w:val="20"/>
-          <w:szCs w:val="20"/>
-        </w:rPr>
-        <w:t xml:space="preserve">4.	</w:t>
-      </w:r>
-      <w:r>
-        <w:rPr>
-          <w:rFonts w:ascii="Calibri" w:cs="Calibri" w:eastAsia="Calibri" w:hAnsi="Calibri"/>
-          <w:sz w:val="20"/>
-          <w:szCs w:val="20"/>
-        </w:rPr>
-        <w:t xml:space="preserve">Choisissez votre mot de passe définitif (10 caractères au moins), puis reconnectez-vous.</w:t>
+        <w:t xml:space="preserve">Choisissez votre mot de passe définitif (10 caractères au moins), puis reconnectez-vous avec lui.</w:t>
       </w:r>
     </w:p>
     <w:p>
@@ -224,7 +195,7 @@
           <w:sz w:val="20"/>
           <w:szCs w:val="20"/>
         </w:rPr>
-        <w:t xml:space="preserve">Votre compte est personnel : il est lié à votre téléphone. Ne le prêtez pas ; si une autre personne doit tester, demandez-lui un compte.</w:t>
+        <w:t xml:space="preserve">Votre compte est personnel : ne le prêtez pas ; si une autre personne doit tester, demandez-lui un compte. Mot de passe oublié : demandez à l'administrateur de vous en redonner un provisoire.</w:t>
       </w:r>
     </w:p>
     <w:p>
@@ -238,7 +209,7 @@
           <w:sz w:val="20"/>
           <w:szCs w:val="20"/>
         </w:rPr>
-        <w:t xml:space="preserve">Code refusé ? Attendez le code suivant : il change toutes les 30 secondes. Téléphone perdu ou changé : demandez à l'administrateur de remettre votre double authentification à zéro.</w:t>
+        <w:t xml:space="preserve">Double authentification : pendant la période de test, elle est désactivée sur la recette. Elle sera obligatoire sur la plateforme réelle : à la première connexion, vous installerez Google Authenticator ou Microsoft Authenticator sur votre téléphone, scannerez le code affiché, puis taperez à chaque connexion le code à 6 chiffres de l'application.</w:t>
       </w:r>
     </w:p>
     <w:p>

</xml_diff>

<commit_message>
Guide des testeurs : connexion par l'adresse de chaque application et mot de passe commun de la recette
Co-Authored-By: Claude Opus 5.5 <noreply@anthropic.com>
</commit_message>
<xml_diff>
--- a/docs/projet/Guide_des_testeurs.docx
+++ b/docs/projet/Guide_des_testeurs.docx
@@ -94,7 +94,7 @@
           <w:sz w:val="26"/>
           <w:szCs w:val="26"/>
         </w:rPr>
-        <w:t xml:space="preserve">1. Se connecter la première fois</w:t>
+        <w:t xml:space="preserve">1. Se connecter</w:t>
       </w:r>
     </w:p>
     <w:p>
@@ -123,7 +123,7 @@
           <w:sz w:val="20"/>
           <w:szCs w:val="20"/>
         </w:rPr>
-        <w:t xml:space="preserve">Ouvrez l'adresse de la recette remise par la direction, dans Chrome ou Edge sur ordinateur (Safari peut bloquer la session), dans Chrome sur téléphone.</w:t>
+        <w:t xml:space="preserve">Ouvrez l'adresse de votre application (tableau ci-dessous), dans Chrome ou Edge sur ordinateur (Safari peut bloquer la session), dans Chrome sur téléphone.</w:t>
       </w:r>
     </w:p>
     <w:p>
@@ -152,36 +152,7 @@
           <w:sz w:val="20"/>
           <w:szCs w:val="20"/>
         </w:rPr>
-        <w:t xml:space="preserve">Saisissez votre identifiant et le mot de passe provisoire qui vous ont été remis, puis « Se connecter ».</w:t>
-      </w:r>
-    </w:p>
-    <w:p>
-      <w:pPr>
-        <w:tabs>
-          <w:tab w:val="left" w:pos="360"/>
-        </w:tabs>
-        <w:spacing w:after="60"/>
-        <w:ind w:left="360" w:hanging="360"/>
-        <w:jc w:val="both"/>
-      </w:pPr>
-      <w:r>
-        <w:rPr>
-          <w:rFonts w:ascii="Calibri" w:cs="Calibri" w:eastAsia="Calibri" w:hAnsi="Calibri"/>
-          <w:b/>
-          <w:bCs/>
-          <w:color w:val="1A9E9E"/>
-          <w:sz w:val="20"/>
-          <w:szCs w:val="20"/>
-        </w:rPr>
-        <w:t xml:space="preserve">3.	</w:t>
-      </w:r>
-      <w:r>
-        <w:rPr>
-          <w:rFonts w:ascii="Calibri" w:cs="Calibri" w:eastAsia="Calibri" w:hAnsi="Calibri"/>
-          <w:sz w:val="20"/>
-          <w:szCs w:val="20"/>
-        </w:rPr>
-        <w:t xml:space="preserve">Choisissez votre mot de passe définitif (10 caractères au moins), puis reconnectez-vous avec lui.</w:t>
+        <w:t xml:space="preserve">Saisissez votre identifiant et le mot de passe commun de la recette, communiqué par E-VOLUTION XP, puis « Se connecter ».</w:t>
       </w:r>
     </w:p>
     <w:p>
@@ -195,55 +166,7 @@
           <w:sz w:val="20"/>
           <w:szCs w:val="20"/>
         </w:rPr>
-        <w:t xml:space="preserve">Votre compte est personnel : ne le prêtez pas ; si une autre personne doit tester, demandez-lui un compte. Mot de passe oublié : demandez à l'administrateur de vous en redonner un provisoire.</w:t>
-      </w:r>
-    </w:p>
-    <w:p>
-      <w:pPr>
-        <w:spacing w:after="100"/>
-        <w:jc w:val="both"/>
-      </w:pPr>
-      <w:r>
-        <w:rPr>
-          <w:rFonts w:ascii="Calibri" w:cs="Calibri" w:eastAsia="Calibri" w:hAnsi="Calibri"/>
-          <w:sz w:val="20"/>
-          <w:szCs w:val="20"/>
-        </w:rPr>
-        <w:t xml:space="preserve">Double authentification : pendant la période de test, elle est désactivée sur la recette. Elle sera obligatoire sur la plateforme réelle : à la première connexion, vous installerez Google Authenticator ou Microsoft Authenticator sur votre téléphone, scannerez le code affiché, puis taperez à chaque connexion le code à 6 chiffres de l'application.</w:t>
-      </w:r>
-    </w:p>
-    <w:p>
-      <w:pPr>
-        <w:keepNext/>
-        <w:pBdr>
-          <w:bottom w:val="single" w:color="1A9E9E" w:sz="6" w:space="2"/>
-        </w:pBdr>
-        <w:spacing w:after="100" w:before="280"/>
-      </w:pPr>
-      <w:r>
-        <w:rPr>
-          <w:rFonts w:ascii="Calibri" w:cs="Calibri" w:eastAsia="Calibri" w:hAnsi="Calibri"/>
-          <w:b/>
-          <w:bCs/>
-          <w:color w:val="1C1E6B"/>
-          <w:sz w:val="26"/>
-          <w:szCs w:val="26"/>
-        </w:rPr>
-        <w:t xml:space="preserve">2. Deux sociétés, plusieurs applications</w:t>
-      </w:r>
-    </w:p>
-    <w:p>
-      <w:pPr>
-        <w:spacing w:after="100"/>
-        <w:jc w:val="both"/>
-      </w:pPr>
-      <w:r>
-        <w:rPr>
-          <w:rFonts w:ascii="Calibri" w:cs="Calibri" w:eastAsia="Calibri" w:hAnsi="Calibri"/>
-          <w:sz w:val="20"/>
-          <w:szCs w:val="20"/>
-        </w:rPr>
-        <w:t xml:space="preserve">EGUITRA GROUP SARLU et MB AxisPro sont deux entreprises distinctes : chacune a sa comptabilité, ses clients, ses factures. La plateforme les sert par applications :</w:t>
+        <w:t xml:space="preserve">La connexion se fait toujours dans une application : celle de l'adresse ouverte. L'adresse de la recette, seule, ouvre la connexion à Finance, puis l'accueil NIMOVA, d'où l'on passe aux autres applications du compte. Un compte qui n'a pas Finance (cabinet, RH, salarié, porteur) ouvre l'adresse de son application ; sinon la connexion répond « Votre profil ne donne pas accès à cette application. ».</w:t>
       </w:r>
     </w:p>
     <w:tbl>
@@ -259,10 +182,9 @@
         </w:tblBorders>
       </w:tblPr>
       <w:tblGrid>
-        <w:gridCol w:w="1852"/>
-        <w:gridCol w:w="1651"/>
-        <w:gridCol w:w="2766"/>
-        <w:gridCol w:w="3369"/>
+        <w:gridCol w:w="2891"/>
+        <w:gridCol w:w="3277"/>
+        <w:gridCol w:w="3470"/>
       </w:tblGrid>
       <w:tr>
         <w:trPr>
@@ -270,7 +192,7 @@
         </w:trPr>
         <w:tc>
           <w:tcPr>
-            <w:tcW w:type="dxa" w:w="1852"/>
+            <w:tcW w:type="dxa" w:w="2891"/>
             <w:tcBorders>
               <w:top w:val="single" w:color="C9CFD8" w:sz="4"/>
               <w:left w:val="single" w:color="C9CFD8" w:sz="4"/>
@@ -305,7 +227,7 @@
         </w:tc>
         <w:tc>
           <w:tcPr>
-            <w:tcW w:type="dxa" w:w="1651"/>
+            <w:tcW w:type="dxa" w:w="3277"/>
             <w:tcBorders>
               <w:top w:val="single" w:color="C9CFD8" w:sz="4"/>
               <w:left w:val="single" w:color="C9CFD8" w:sz="4"/>
@@ -334,13 +256,13 @@
                 <w:sz w:val="17"/>
                 <w:szCs w:val="17"/>
               </w:rPr>
-              <w:t xml:space="preserve">Adresse (à la suite de celle de la recette)</w:t>
-            </w:r>
-          </w:p>
-        </w:tc>
-        <w:tc>
-          <w:tcPr>
-            <w:tcW w:type="dxa" w:w="2766"/>
+              <w:t xml:space="preserve">Adresse à ouvrir</w:t>
+            </w:r>
+          </w:p>
+        </w:tc>
+        <w:tc>
+          <w:tcPr>
+            <w:tcW w:type="dxa" w:w="3470"/>
             <w:tcBorders>
               <w:top w:val="single" w:color="C9CFD8" w:sz="4"/>
               <w:left w:val="single" w:color="C9CFD8" w:sz="4"/>
@@ -369,42 +291,7 @@
                 <w:sz w:val="17"/>
                 <w:szCs w:val="17"/>
               </w:rPr>
-              <w:t xml:space="preserve">Pour qui</w:t>
-            </w:r>
-          </w:p>
-        </w:tc>
-        <w:tc>
-          <w:tcPr>
-            <w:tcW w:type="dxa" w:w="3369"/>
-            <w:tcBorders>
-              <w:top w:val="single" w:color="C9CFD8" w:sz="4"/>
-              <w:left w:val="single" w:color="C9CFD8" w:sz="4"/>
-              <w:bottom w:val="single" w:color="C9CFD8" w:sz="4"/>
-              <w:right w:val="single" w:color="C9CFD8" w:sz="4"/>
-            </w:tcBorders>
-            <w:shd w:fill="1C1E6B" w:color="auto" w:val="clear"/>
-            <w:tcMar>
-              <w:top w:type="dxa" w:w="50"/>
-              <w:left w:type="dxa" w:w="90"/>
-              <w:bottom w:type="dxa" w:w="50"/>
-              <w:right w:type="dxa" w:w="90"/>
-            </w:tcMar>
-            <w:vAlign w:val="center"/>
-          </w:tcPr>
-          <w:p>
-            <w:pPr>
-              <w:spacing w:after="0"/>
-            </w:pPr>
-            <w:r>
-              <w:rPr>
-                <w:rFonts w:ascii="Calibri" w:cs="Calibri" w:eastAsia="Calibri" w:hAnsi="Calibri"/>
-                <w:b/>
-                <w:bCs/>
-                <w:color w:val="FFFFFF"/>
-                <w:sz w:val="17"/>
-                <w:szCs w:val="17"/>
-              </w:rPr>
-              <w:t xml:space="preserve">Société</w:t>
+              <w:t xml:space="preserve">Comptes de test</w:t>
             </w:r>
           </w:p>
         </w:tc>
@@ -412,125 +299,94 @@
       <w:tr>
         <w:tc>
           <w:tcPr>
-            <w:tcW w:type="dxa" w:w="1852"/>
-            <w:tcBorders>
-              <w:top w:val="single" w:color="C9CFD8" w:sz="4"/>
-              <w:left w:val="single" w:color="C9CFD8" w:sz="4"/>
-              <w:bottom w:val="single" w:color="C9CFD8" w:sz="4"/>
-              <w:right w:val="single" w:color="C9CFD8" w:sz="4"/>
-            </w:tcBorders>
-            <w:tcMar>
-              <w:top w:type="dxa" w:w="50"/>
-              <w:left w:type="dxa" w:w="90"/>
-              <w:bottom w:type="dxa" w:w="50"/>
-              <w:right w:type="dxa" w:w="90"/>
-            </w:tcMar>
-            <w:vAlign w:val="center"/>
-          </w:tcPr>
-          <w:p>
-            <w:pPr>
-              <w:spacing w:after="0"/>
-            </w:pPr>
-            <w:r>
-              <w:rPr>
-                <w:rFonts w:ascii="Calibri" w:cs="Calibri" w:eastAsia="Calibri" w:hAnsi="Calibri"/>
-                <w:sz w:val="17"/>
-                <w:szCs w:val="17"/>
-              </w:rPr>
-              <w:t xml:space="preserve">NIMOVA · Finance</w:t>
-            </w:r>
-          </w:p>
-        </w:tc>
-        <w:tc>
-          <w:tcPr>
-            <w:tcW w:type="dxa" w:w="1651"/>
-            <w:tcBorders>
-              <w:top w:val="single" w:color="C9CFD8" w:sz="4"/>
-              <w:left w:val="single" w:color="C9CFD8" w:sz="4"/>
-              <w:bottom w:val="single" w:color="C9CFD8" w:sz="4"/>
-              <w:right w:val="single" w:color="C9CFD8" w:sz="4"/>
-            </w:tcBorders>
-            <w:tcMar>
-              <w:top w:type="dxa" w:w="50"/>
-              <w:left w:type="dxa" w:w="90"/>
-              <w:bottom w:type="dxa" w:w="50"/>
-              <w:right w:type="dxa" w:w="90"/>
-            </w:tcMar>
-            <w:vAlign w:val="center"/>
-          </w:tcPr>
-          <w:p>
-            <w:pPr>
-              <w:spacing w:after="0"/>
-            </w:pPr>
-            <w:r>
-              <w:rPr>
-                <w:rFonts w:ascii="Calibri" w:cs="Calibri" w:eastAsia="Calibri" w:hAnsi="Calibri"/>
-                <w:sz w:val="17"/>
-                <w:szCs w:val="17"/>
-              </w:rPr>
-              <w:t xml:space="preserve">/finance</w:t>
-            </w:r>
-          </w:p>
-        </w:tc>
-        <w:tc>
-          <w:tcPr>
-            <w:tcW w:type="dxa" w:w="2766"/>
-            <w:tcBorders>
-              <w:top w:val="single" w:color="C9CFD8" w:sz="4"/>
-              <w:left w:val="single" w:color="C9CFD8" w:sz="4"/>
-              <w:bottom w:val="single" w:color="C9CFD8" w:sz="4"/>
-              <w:right w:val="single" w:color="C9CFD8" w:sz="4"/>
-            </w:tcBorders>
-            <w:tcMar>
-              <w:top w:type="dxa" w:w="50"/>
-              <w:left w:type="dxa" w:w="90"/>
-              <w:bottom w:type="dxa" w:w="50"/>
-              <w:right w:type="dxa" w:w="90"/>
-            </w:tcMar>
-            <w:vAlign w:val="center"/>
-          </w:tcPr>
-          <w:p>
-            <w:pPr>
-              <w:spacing w:after="0"/>
-            </w:pPr>
-            <w:r>
-              <w:rPr>
-                <w:rFonts w:ascii="Calibri" w:cs="Calibri" w:eastAsia="Calibri" w:hAnsi="Calibri"/>
-                <w:sz w:val="17"/>
-                <w:szCs w:val="17"/>
-              </w:rPr>
-              <w:t xml:space="preserve">Direction, finance, métiers d'EGUITRA</w:t>
-            </w:r>
-          </w:p>
-        </w:tc>
-        <w:tc>
-          <w:tcPr>
-            <w:tcW w:type="dxa" w:w="3369"/>
-            <w:tcBorders>
-              <w:top w:val="single" w:color="C9CFD8" w:sz="4"/>
-              <w:left w:val="single" w:color="C9CFD8" w:sz="4"/>
-              <w:bottom w:val="single" w:color="C9CFD8" w:sz="4"/>
-              <w:right w:val="single" w:color="C9CFD8" w:sz="4"/>
-            </w:tcBorders>
-            <w:tcMar>
-              <w:top w:type="dxa" w:w="50"/>
-              <w:left w:type="dxa" w:w="90"/>
-              <w:bottom w:type="dxa" w:w="50"/>
-              <w:right w:type="dxa" w:w="90"/>
-            </w:tcMar>
-            <w:vAlign w:val="center"/>
-          </w:tcPr>
-          <w:p>
-            <w:pPr>
-              <w:spacing w:after="0"/>
-            </w:pPr>
-            <w:r>
-              <w:rPr>
-                <w:rFonts w:ascii="Calibri" w:cs="Calibri" w:eastAsia="Calibri" w:hAnsi="Calibri"/>
-                <w:sz w:val="17"/>
-                <w:szCs w:val="17"/>
-              </w:rPr>
-              <w:t xml:space="preserve">Les deux, séparément : la société de travail se choisit dans la colonne de gauche</w:t>
+            <w:tcW w:type="dxa" w:w="2891"/>
+            <w:tcBorders>
+              <w:top w:val="single" w:color="C9CFD8" w:sz="4"/>
+              <w:left w:val="single" w:color="C9CFD8" w:sz="4"/>
+              <w:bottom w:val="single" w:color="C9CFD8" w:sz="4"/>
+              <w:right w:val="single" w:color="C9CFD8" w:sz="4"/>
+            </w:tcBorders>
+            <w:tcMar>
+              <w:top w:type="dxa" w:w="50"/>
+              <w:left w:type="dxa" w:w="90"/>
+              <w:bottom w:type="dxa" w:w="50"/>
+              <w:right w:type="dxa" w:w="90"/>
+            </w:tcMar>
+            <w:vAlign w:val="center"/>
+          </w:tcPr>
+          <w:p>
+            <w:pPr>
+              <w:spacing w:after="0"/>
+            </w:pPr>
+            <w:r>
+              <w:rPr>
+                <w:rFonts w:ascii="Calibri" w:cs="Calibri" w:eastAsia="Calibri" w:hAnsi="Calibri"/>
+                <w:sz w:val="17"/>
+                <w:szCs w:val="17"/>
+              </w:rPr>
+              <w:t xml:space="preserve">Finance, Transport, Analyse, RH (par l'accueil NIMOVA)</w:t>
+            </w:r>
+          </w:p>
+        </w:tc>
+        <w:tc>
+          <w:tcPr>
+            <w:tcW w:type="dxa" w:w="3277"/>
+            <w:tcBorders>
+              <w:top w:val="single" w:color="C9CFD8" w:sz="4"/>
+              <w:left w:val="single" w:color="C9CFD8" w:sz="4"/>
+              <w:bottom w:val="single" w:color="C9CFD8" w:sz="4"/>
+              <w:right w:val="single" w:color="C9CFD8" w:sz="4"/>
+            </w:tcBorders>
+            <w:tcMar>
+              <w:top w:type="dxa" w:w="50"/>
+              <w:left w:type="dxa" w:w="90"/>
+              <w:bottom w:type="dxa" w:w="50"/>
+              <w:right w:type="dxa" w:w="90"/>
+            </w:tcMar>
+            <w:vAlign w:val="center"/>
+          </w:tcPr>
+          <w:p>
+            <w:pPr>
+              <w:spacing w:after="0"/>
+            </w:pPr>
+            <w:r>
+              <w:rPr>
+                <w:rFonts w:ascii="Calibri" w:cs="Calibri" w:eastAsia="Calibri" w:hAnsi="Calibri"/>
+                <w:sz w:val="17"/>
+                <w:szCs w:val="17"/>
+              </w:rPr>
+              <w:t xml:space="preserve">l'adresse de la recette</w:t>
+            </w:r>
+          </w:p>
+        </w:tc>
+        <w:tc>
+          <w:tcPr>
+            <w:tcW w:type="dxa" w:w="3470"/>
+            <w:tcBorders>
+              <w:top w:val="single" w:color="C9CFD8" w:sz="4"/>
+              <w:left w:val="single" w:color="C9CFD8" w:sz="4"/>
+              <w:bottom w:val="single" w:color="C9CFD8" w:sz="4"/>
+              <w:right w:val="single" w:color="C9CFD8" w:sz="4"/>
+            </w:tcBorders>
+            <w:tcMar>
+              <w:top w:type="dxa" w:w="50"/>
+              <w:left w:type="dxa" w:w="90"/>
+              <w:bottom w:type="dxa" w:w="50"/>
+              <w:right w:type="dxa" w:w="90"/>
+            </w:tcMar>
+            <w:vAlign w:val="center"/>
+          </w:tcPr>
+          <w:p>
+            <w:pPr>
+              <w:spacing w:after="0"/>
+            </w:pPr>
+            <w:r>
+              <w:rPr>
+                <w:rFonts w:ascii="Calibri" w:cs="Calibri" w:eastAsia="Calibri" w:hAnsi="Calibri"/>
+                <w:sz w:val="17"/>
+                <w:szCs w:val="17"/>
+              </w:rPr>
+              <w:t xml:space="preserve">test.dg, test.daf, test.comptable, test.achats, test.exploitation, test.parc, test.chantiers, test.immobilier, test.admin</w:t>
             </w:r>
           </w:p>
         </w:tc>
@@ -538,7 +394,7 @@
       <w:tr>
         <w:tc>
           <w:tcPr>
-            <w:tcW w:type="dxa" w:w="1852"/>
+            <w:tcW w:type="dxa" w:w="2891"/>
             <w:tcBorders>
               <w:top w:val="single" w:color="C9CFD8" w:sz="4"/>
               <w:left w:val="single" w:color="C9CFD8" w:sz="4"/>
@@ -564,13 +420,13 @@
                 <w:sz w:val="17"/>
                 <w:szCs w:val="17"/>
               </w:rPr>
-              <w:t xml:space="preserve">NIMOVA · AxisPro</w:t>
-            </w:r>
-          </w:p>
-        </w:tc>
-        <w:tc>
-          <w:tcPr>
-            <w:tcW w:type="dxa" w:w="1651"/>
+              <w:t xml:space="preserve">MB AxisPro Consulting (AxisPro Suite)</w:t>
+            </w:r>
+          </w:p>
+        </w:tc>
+        <w:tc>
+          <w:tcPr>
+            <w:tcW w:type="dxa" w:w="3277"/>
             <w:tcBorders>
               <w:top w:val="single" w:color="C9CFD8" w:sz="4"/>
               <w:left w:val="single" w:color="C9CFD8" w:sz="4"/>
@@ -596,13 +452,13 @@
                 <w:sz w:val="17"/>
                 <w:szCs w:val="17"/>
               </w:rPr>
-              <w:t xml:space="preserve">/axispro</w:t>
-            </w:r>
-          </w:p>
-        </w:tc>
-        <w:tc>
-          <w:tcPr>
-            <w:tcW w:type="dxa" w:w="2766"/>
+              <w:t xml:space="preserve">l'adresse de la recette suivie de /axispro</w:t>
+            </w:r>
+          </w:p>
+        </w:tc>
+        <w:tc>
+          <w:tcPr>
+            <w:tcW w:type="dxa" w:w="3470"/>
             <w:tcBorders>
               <w:top w:val="single" w:color="C9CFD8" w:sz="4"/>
               <w:left w:val="single" w:color="C9CFD8" w:sz="4"/>
@@ -628,39 +484,7 @@
                 <w:sz w:val="17"/>
                 <w:szCs w:val="17"/>
               </w:rPr>
-              <w:t xml:space="preserve">Direction, consultants du cabinet</w:t>
-            </w:r>
-          </w:p>
-        </w:tc>
-        <w:tc>
-          <w:tcPr>
-            <w:tcW w:type="dxa" w:w="3369"/>
-            <w:tcBorders>
-              <w:top w:val="single" w:color="C9CFD8" w:sz="4"/>
-              <w:left w:val="single" w:color="C9CFD8" w:sz="4"/>
-              <w:bottom w:val="single" w:color="C9CFD8" w:sz="4"/>
-              <w:right w:val="single" w:color="C9CFD8" w:sz="4"/>
-            </w:tcBorders>
-            <w:shd w:fill="F2F4F7" w:color="auto" w:val="clear"/>
-            <w:tcMar>
-              <w:top w:type="dxa" w:w="50"/>
-              <w:left w:type="dxa" w:w="90"/>
-              <w:bottom w:type="dxa" w:w="50"/>
-              <w:right w:type="dxa" w:w="90"/>
-            </w:tcMar>
-            <w:vAlign w:val="center"/>
-          </w:tcPr>
-          <w:p>
-            <w:pPr>
-              <w:spacing w:after="0"/>
-            </w:pPr>
-            <w:r>
-              <w:rPr>
-                <w:rFonts w:ascii="Calibri" w:cs="Calibri" w:eastAsia="Calibri" w:hAnsi="Calibri"/>
-                <w:sz w:val="17"/>
-                <w:szCs w:val="17"/>
-              </w:rPr>
-              <w:t xml:space="preserve">MB AxisPro seulement</w:t>
+              <w:t xml:space="preserve">test.consultant, test.associe</w:t>
             </w:r>
           </w:p>
         </w:tc>
@@ -668,125 +492,94 @@
       <w:tr>
         <w:tc>
           <w:tcPr>
-            <w:tcW w:type="dxa" w:w="1852"/>
-            <w:tcBorders>
-              <w:top w:val="single" w:color="C9CFD8" w:sz="4"/>
-              <w:left w:val="single" w:color="C9CFD8" w:sz="4"/>
-              <w:bottom w:val="single" w:color="C9CFD8" w:sz="4"/>
-              <w:right w:val="single" w:color="C9CFD8" w:sz="4"/>
-            </w:tcBorders>
-            <w:tcMar>
-              <w:top w:type="dxa" w:w="50"/>
-              <w:left w:type="dxa" w:w="90"/>
-              <w:bottom w:type="dxa" w:w="50"/>
-              <w:right w:type="dxa" w:w="90"/>
-            </w:tcMar>
-            <w:vAlign w:val="center"/>
-          </w:tcPr>
-          <w:p>
-            <w:pPr>
-              <w:spacing w:after="0"/>
-            </w:pPr>
-            <w:r>
-              <w:rPr>
-                <w:rFonts w:ascii="Calibri" w:cs="Calibri" w:eastAsia="Calibri" w:hAnsi="Calibri"/>
-                <w:sz w:val="17"/>
-                <w:szCs w:val="17"/>
-              </w:rPr>
-              <w:t xml:space="preserve">Rotations</w:t>
-            </w:r>
-          </w:p>
-        </w:tc>
-        <w:tc>
-          <w:tcPr>
-            <w:tcW w:type="dxa" w:w="1651"/>
-            <w:tcBorders>
-              <w:top w:val="single" w:color="C9CFD8" w:sz="4"/>
-              <w:left w:val="single" w:color="C9CFD8" w:sz="4"/>
-              <w:bottom w:val="single" w:color="C9CFD8" w:sz="4"/>
-              <w:right w:val="single" w:color="C9CFD8" w:sz="4"/>
-            </w:tcBorders>
-            <w:tcMar>
-              <w:top w:type="dxa" w:w="50"/>
-              <w:left w:type="dxa" w:w="90"/>
-              <w:bottom w:type="dxa" w:w="50"/>
-              <w:right w:type="dxa" w:w="90"/>
-            </w:tcMar>
-            <w:vAlign w:val="center"/>
-          </w:tcPr>
-          <w:p>
-            <w:pPr>
-              <w:spacing w:after="0"/>
-            </w:pPr>
-            <w:r>
-              <w:rPr>
-                <w:rFonts w:ascii="Calibri" w:cs="Calibri" w:eastAsia="Calibri" w:hAnsi="Calibri"/>
-                <w:sz w:val="17"/>
-                <w:szCs w:val="17"/>
-              </w:rPr>
-              <w:t xml:space="preserve">/mobile</w:t>
-            </w:r>
-          </w:p>
-        </w:tc>
-        <w:tc>
-          <w:tcPr>
-            <w:tcW w:type="dxa" w:w="2766"/>
-            <w:tcBorders>
-              <w:top w:val="single" w:color="C9CFD8" w:sz="4"/>
-              <w:left w:val="single" w:color="C9CFD8" w:sz="4"/>
-              <w:bottom w:val="single" w:color="C9CFD8" w:sz="4"/>
-              <w:right w:val="single" w:color="C9CFD8" w:sz="4"/>
-            </w:tcBorders>
-            <w:tcMar>
-              <w:top w:type="dxa" w:w="50"/>
-              <w:left w:type="dxa" w:w="90"/>
-              <w:bottom w:type="dxa" w:w="50"/>
-              <w:right w:type="dxa" w:w="90"/>
-            </w:tcMar>
-            <w:vAlign w:val="center"/>
-          </w:tcPr>
-          <w:p>
-            <w:pPr>
-              <w:spacing w:after="0"/>
-            </w:pPr>
-            <w:r>
-              <w:rPr>
-                <w:rFonts w:ascii="Calibri" w:cs="Calibri" w:eastAsia="Calibri" w:hAnsi="Calibri"/>
-                <w:sz w:val="17"/>
-                <w:szCs w:val="17"/>
-              </w:rPr>
-              <w:t xml:space="preserve">Exploitation, agents de parc</w:t>
-            </w:r>
-          </w:p>
-        </w:tc>
-        <w:tc>
-          <w:tcPr>
-            <w:tcW w:type="dxa" w:w="3369"/>
-            <w:tcBorders>
-              <w:top w:val="single" w:color="C9CFD8" w:sz="4"/>
-              <w:left w:val="single" w:color="C9CFD8" w:sz="4"/>
-              <w:bottom w:val="single" w:color="C9CFD8" w:sz="4"/>
-              <w:right w:val="single" w:color="C9CFD8" w:sz="4"/>
-            </w:tcBorders>
-            <w:tcMar>
-              <w:top w:type="dxa" w:w="50"/>
-              <w:left w:type="dxa" w:w="90"/>
-              <w:bottom w:type="dxa" w:w="50"/>
-              <w:right w:type="dxa" w:w="90"/>
-            </w:tcMar>
-            <w:vAlign w:val="center"/>
-          </w:tcPr>
-          <w:p>
-            <w:pPr>
-              <w:spacing w:after="0"/>
-            </w:pPr>
-            <w:r>
-              <w:rPr>
-                <w:rFonts w:ascii="Calibri" w:cs="Calibri" w:eastAsia="Calibri" w:hAnsi="Calibri"/>
-                <w:sz w:val="17"/>
-                <w:szCs w:val="17"/>
-              </w:rPr>
-              <w:t xml:space="preserve">EGUITRA GROUP seulement</w:t>
+            <w:tcW w:type="dxa" w:w="2891"/>
+            <w:tcBorders>
+              <w:top w:val="single" w:color="C9CFD8" w:sz="4"/>
+              <w:left w:val="single" w:color="C9CFD8" w:sz="4"/>
+              <w:bottom w:val="single" w:color="C9CFD8" w:sz="4"/>
+              <w:right w:val="single" w:color="C9CFD8" w:sz="4"/>
+            </w:tcBorders>
+            <w:tcMar>
+              <w:top w:type="dxa" w:w="50"/>
+              <w:left w:type="dxa" w:w="90"/>
+              <w:bottom w:type="dxa" w:w="50"/>
+              <w:right w:type="dxa" w:w="90"/>
+            </w:tcMar>
+            <w:vAlign w:val="center"/>
+          </w:tcPr>
+          <w:p>
+            <w:pPr>
+              <w:spacing w:after="0"/>
+            </w:pPr>
+            <w:r>
+              <w:rPr>
+                <w:rFonts w:ascii="Calibri" w:cs="Calibri" w:eastAsia="Calibri" w:hAnsi="Calibri"/>
+                <w:sz w:val="17"/>
+                <w:szCs w:val="17"/>
+              </w:rPr>
+              <w:t xml:space="preserve">Analyse, pour le cabinet</w:t>
+            </w:r>
+          </w:p>
+        </w:tc>
+        <w:tc>
+          <w:tcPr>
+            <w:tcW w:type="dxa" w:w="3277"/>
+            <w:tcBorders>
+              <w:top w:val="single" w:color="C9CFD8" w:sz="4"/>
+              <w:left w:val="single" w:color="C9CFD8" w:sz="4"/>
+              <w:bottom w:val="single" w:color="C9CFD8" w:sz="4"/>
+              <w:right w:val="single" w:color="C9CFD8" w:sz="4"/>
+            </w:tcBorders>
+            <w:tcMar>
+              <w:top w:type="dxa" w:w="50"/>
+              <w:left w:type="dxa" w:w="90"/>
+              <w:bottom w:type="dxa" w:w="50"/>
+              <w:right w:type="dxa" w:w="90"/>
+            </w:tcMar>
+            <w:vAlign w:val="center"/>
+          </w:tcPr>
+          <w:p>
+            <w:pPr>
+              <w:spacing w:after="0"/>
+            </w:pPr>
+            <w:r>
+              <w:rPr>
+                <w:rFonts w:ascii="Calibri" w:cs="Calibri" w:eastAsia="Calibri" w:hAnsi="Calibri"/>
+                <w:sz w:val="17"/>
+                <w:szCs w:val="17"/>
+              </w:rPr>
+              <w:t xml:space="preserve">l'adresse de la recette suivie de /analyse</w:t>
+            </w:r>
+          </w:p>
+        </w:tc>
+        <w:tc>
+          <w:tcPr>
+            <w:tcW w:type="dxa" w:w="3470"/>
+            <w:tcBorders>
+              <w:top w:val="single" w:color="C9CFD8" w:sz="4"/>
+              <w:left w:val="single" w:color="C9CFD8" w:sz="4"/>
+              <w:bottom w:val="single" w:color="C9CFD8" w:sz="4"/>
+              <w:right w:val="single" w:color="C9CFD8" w:sz="4"/>
+            </w:tcBorders>
+            <w:tcMar>
+              <w:top w:type="dxa" w:w="50"/>
+              <w:left w:type="dxa" w:w="90"/>
+              <w:bottom w:type="dxa" w:w="50"/>
+              <w:right w:type="dxa" w:w="90"/>
+            </w:tcMar>
+            <w:vAlign w:val="center"/>
+          </w:tcPr>
+          <w:p>
+            <w:pPr>
+              <w:spacing w:after="0"/>
+            </w:pPr>
+            <w:r>
+              <w:rPr>
+                <w:rFonts w:ascii="Calibri" w:cs="Calibri" w:eastAsia="Calibri" w:hAnsi="Calibri"/>
+                <w:sz w:val="17"/>
+                <w:szCs w:val="17"/>
+              </w:rPr>
+              <w:t xml:space="preserve">test.consultant, test.associe</w:t>
             </w:r>
           </w:p>
         </w:tc>
@@ -794,7 +587,7 @@
       <w:tr>
         <w:tc>
           <w:tcPr>
-            <w:tcW w:type="dxa" w:w="1852"/>
+            <w:tcW w:type="dxa" w:w="2891"/>
             <w:tcBorders>
               <w:top w:val="single" w:color="C9CFD8" w:sz="4"/>
               <w:left w:val="single" w:color="C9CFD8" w:sz="4"/>
@@ -820,13 +613,206 @@
                 <w:sz w:val="17"/>
                 <w:szCs w:val="17"/>
               </w:rPr>
+              <w:t xml:space="preserve">RH et « Mon espace »</w:t>
+            </w:r>
+          </w:p>
+        </w:tc>
+        <w:tc>
+          <w:tcPr>
+            <w:tcW w:type="dxa" w:w="3277"/>
+            <w:tcBorders>
+              <w:top w:val="single" w:color="C9CFD8" w:sz="4"/>
+              <w:left w:val="single" w:color="C9CFD8" w:sz="4"/>
+              <w:bottom w:val="single" w:color="C9CFD8" w:sz="4"/>
+              <w:right w:val="single" w:color="C9CFD8" w:sz="4"/>
+            </w:tcBorders>
+            <w:shd w:fill="F2F4F7" w:color="auto" w:val="clear"/>
+            <w:tcMar>
+              <w:top w:type="dxa" w:w="50"/>
+              <w:left w:type="dxa" w:w="90"/>
+              <w:bottom w:type="dxa" w:w="50"/>
+              <w:right w:type="dxa" w:w="90"/>
+            </w:tcMar>
+            <w:vAlign w:val="center"/>
+          </w:tcPr>
+          <w:p>
+            <w:pPr>
+              <w:spacing w:after="0"/>
+            </w:pPr>
+            <w:r>
+              <w:rPr>
+                <w:rFonts w:ascii="Calibri" w:cs="Calibri" w:eastAsia="Calibri" w:hAnsi="Calibri"/>
+                <w:sz w:val="17"/>
+                <w:szCs w:val="17"/>
+              </w:rPr>
+              <w:t xml:space="preserve">l'adresse de la recette suivie de /rh</w:t>
+            </w:r>
+          </w:p>
+        </w:tc>
+        <w:tc>
+          <w:tcPr>
+            <w:tcW w:type="dxa" w:w="3470"/>
+            <w:tcBorders>
+              <w:top w:val="single" w:color="C9CFD8" w:sz="4"/>
+              <w:left w:val="single" w:color="C9CFD8" w:sz="4"/>
+              <w:bottom w:val="single" w:color="C9CFD8" w:sz="4"/>
+              <w:right w:val="single" w:color="C9CFD8" w:sz="4"/>
+            </w:tcBorders>
+            <w:shd w:fill="F2F4F7" w:color="auto" w:val="clear"/>
+            <w:tcMar>
+              <w:top w:type="dxa" w:w="50"/>
+              <w:left w:type="dxa" w:w="90"/>
+              <w:bottom w:type="dxa" w:w="50"/>
+              <w:right w:type="dxa" w:w="90"/>
+            </w:tcMar>
+            <w:vAlign w:val="center"/>
+          </w:tcPr>
+          <w:p>
+            <w:pPr>
+              <w:spacing w:after="0"/>
+            </w:pPr>
+            <w:r>
+              <w:rPr>
+                <w:rFonts w:ascii="Calibri" w:cs="Calibri" w:eastAsia="Calibri" w:hAnsi="Calibri"/>
+                <w:sz w:val="17"/>
+                <w:szCs w:val="17"/>
+              </w:rPr>
+              <w:t xml:space="preserve">test.rh, test.salarie</w:t>
+            </w:r>
+          </w:p>
+        </w:tc>
+      </w:tr>
+      <w:tr>
+        <w:tc>
+          <w:tcPr>
+            <w:tcW w:type="dxa" w:w="2891"/>
+            <w:tcBorders>
+              <w:top w:val="single" w:color="C9CFD8" w:sz="4"/>
+              <w:left w:val="single" w:color="C9CFD8" w:sz="4"/>
+              <w:bottom w:val="single" w:color="C9CFD8" w:sz="4"/>
+              <w:right w:val="single" w:color="C9CFD8" w:sz="4"/>
+            </w:tcBorders>
+            <w:tcMar>
+              <w:top w:type="dxa" w:w="50"/>
+              <w:left w:type="dxa" w:w="90"/>
+              <w:bottom w:type="dxa" w:w="50"/>
+              <w:right w:type="dxa" w:w="90"/>
+            </w:tcMar>
+            <w:vAlign w:val="center"/>
+          </w:tcPr>
+          <w:p>
+            <w:pPr>
+              <w:spacing w:after="0"/>
+            </w:pPr>
+            <w:r>
+              <w:rPr>
+                <w:rFonts w:ascii="Calibri" w:cs="Calibri" w:eastAsia="Calibri" w:hAnsi="Calibri"/>
+                <w:sz w:val="17"/>
+                <w:szCs w:val="17"/>
+              </w:rPr>
+              <w:t xml:space="preserve">Rotations, au téléphone</w:t>
+            </w:r>
+          </w:p>
+        </w:tc>
+        <w:tc>
+          <w:tcPr>
+            <w:tcW w:type="dxa" w:w="3277"/>
+            <w:tcBorders>
+              <w:top w:val="single" w:color="C9CFD8" w:sz="4"/>
+              <w:left w:val="single" w:color="C9CFD8" w:sz="4"/>
+              <w:bottom w:val="single" w:color="C9CFD8" w:sz="4"/>
+              <w:right w:val="single" w:color="C9CFD8" w:sz="4"/>
+            </w:tcBorders>
+            <w:tcMar>
+              <w:top w:type="dxa" w:w="50"/>
+              <w:left w:type="dxa" w:w="90"/>
+              <w:bottom w:type="dxa" w:w="50"/>
+              <w:right w:type="dxa" w:w="90"/>
+            </w:tcMar>
+            <w:vAlign w:val="center"/>
+          </w:tcPr>
+          <w:p>
+            <w:pPr>
+              <w:spacing w:after="0"/>
+            </w:pPr>
+            <w:r>
+              <w:rPr>
+                <w:rFonts w:ascii="Calibri" w:cs="Calibri" w:eastAsia="Calibri" w:hAnsi="Calibri"/>
+                <w:sz w:val="17"/>
+                <w:szCs w:val="17"/>
+              </w:rPr>
+              <w:t xml:space="preserve">l'adresse de la recette suivie de /mobile</w:t>
+            </w:r>
+          </w:p>
+        </w:tc>
+        <w:tc>
+          <w:tcPr>
+            <w:tcW w:type="dxa" w:w="3470"/>
+            <w:tcBorders>
+              <w:top w:val="single" w:color="C9CFD8" w:sz="4"/>
+              <w:left w:val="single" w:color="C9CFD8" w:sz="4"/>
+              <w:bottom w:val="single" w:color="C9CFD8" w:sz="4"/>
+              <w:right w:val="single" w:color="C9CFD8" w:sz="4"/>
+            </w:tcBorders>
+            <w:tcMar>
+              <w:top w:type="dxa" w:w="50"/>
+              <w:left w:type="dxa" w:w="90"/>
+              <w:bottom w:type="dxa" w:w="50"/>
+              <w:right w:type="dxa" w:w="90"/>
+            </w:tcMar>
+            <w:vAlign w:val="center"/>
+          </w:tcPr>
+          <w:p>
+            <w:pPr>
+              <w:spacing w:after="0"/>
+            </w:pPr>
+            <w:r>
+              <w:rPr>
+                <w:rFonts w:ascii="Calibri" w:cs="Calibri" w:eastAsia="Calibri" w:hAnsi="Calibri"/>
+                <w:sz w:val="17"/>
+                <w:szCs w:val="17"/>
+              </w:rPr>
+              <w:t xml:space="preserve">test.exploitation, test.parc</w:t>
+            </w:r>
+          </w:p>
+        </w:tc>
+      </w:tr>
+      <w:tr>
+        <w:tc>
+          <w:tcPr>
+            <w:tcW w:type="dxa" w:w="2891"/>
+            <w:tcBorders>
+              <w:top w:val="single" w:color="C9CFD8" w:sz="4"/>
+              <w:left w:val="single" w:color="C9CFD8" w:sz="4"/>
+              <w:bottom w:val="single" w:color="C9CFD8" w:sz="4"/>
+              <w:right w:val="single" w:color="C9CFD8" w:sz="4"/>
+            </w:tcBorders>
+            <w:shd w:fill="F2F4F7" w:color="auto" w:val="clear"/>
+            <w:tcMar>
+              <w:top w:type="dxa" w:w="50"/>
+              <w:left w:type="dxa" w:w="90"/>
+              <w:bottom w:type="dxa" w:w="50"/>
+              <w:right w:type="dxa" w:w="90"/>
+            </w:tcMar>
+            <w:vAlign w:val="center"/>
+          </w:tcPr>
+          <w:p>
+            <w:pPr>
+              <w:spacing w:after="0"/>
+            </w:pPr>
+            <w:r>
+              <w:rPr>
+                <w:rFonts w:ascii="Calibri" w:cs="Calibri" w:eastAsia="Calibri" w:hAnsi="Calibri"/>
+                <w:sz w:val="17"/>
+                <w:szCs w:val="17"/>
+              </w:rPr>
               <w:t xml:space="preserve">Portail des porteurs de projets</w:t>
             </w:r>
           </w:p>
         </w:tc>
         <w:tc>
           <w:tcPr>
-            <w:tcW w:type="dxa" w:w="1651"/>
+            <w:tcW w:type="dxa" w:w="3277"/>
             <w:tcBorders>
               <w:top w:val="single" w:color="C9CFD8" w:sz="4"/>
               <w:left w:val="single" w:color="C9CFD8" w:sz="4"/>
@@ -852,13 +838,13 @@
                 <w:sz w:val="17"/>
                 <w:szCs w:val="17"/>
               </w:rPr>
-              <w:t xml:space="preserve">/portail</w:t>
-            </w:r>
-          </w:p>
-        </w:tc>
-        <w:tc>
-          <w:tcPr>
-            <w:tcW w:type="dxa" w:w="2766"/>
+              <w:t xml:space="preserve">l'adresse de la recette suivie de /portail</w:t>
+            </w:r>
+          </w:p>
+        </w:tc>
+        <w:tc>
+          <w:tcPr>
+            <w:tcW w:type="dxa" w:w="3470"/>
             <w:tcBorders>
               <w:top w:val="single" w:color="C9CFD8" w:sz="4"/>
               <w:left w:val="single" w:color="C9CFD8" w:sz="4"/>
@@ -884,39 +870,7 @@
                 <w:sz w:val="17"/>
                 <w:szCs w:val="17"/>
               </w:rPr>
-              <w:t xml:space="preserve">Clients du cabinet</w:t>
-            </w:r>
-          </w:p>
-        </w:tc>
-        <w:tc>
-          <w:tcPr>
-            <w:tcW w:type="dxa" w:w="3369"/>
-            <w:tcBorders>
-              <w:top w:val="single" w:color="C9CFD8" w:sz="4"/>
-              <w:left w:val="single" w:color="C9CFD8" w:sz="4"/>
-              <w:bottom w:val="single" w:color="C9CFD8" w:sz="4"/>
-              <w:right w:val="single" w:color="C9CFD8" w:sz="4"/>
-            </w:tcBorders>
-            <w:shd w:fill="F2F4F7" w:color="auto" w:val="clear"/>
-            <w:tcMar>
-              <w:top w:type="dxa" w:w="50"/>
-              <w:left w:type="dxa" w:w="90"/>
-              <w:bottom w:type="dxa" w:w="50"/>
-              <w:right w:type="dxa" w:w="90"/>
-            </w:tcMar>
-            <w:vAlign w:val="center"/>
-          </w:tcPr>
-          <w:p>
-            <w:pPr>
-              <w:spacing w:after="0"/>
-            </w:pPr>
-            <w:r>
-              <w:rPr>
-                <w:rFonts w:ascii="Calibri" w:cs="Calibri" w:eastAsia="Calibri" w:hAnsi="Calibri"/>
-                <w:sz w:val="17"/>
-                <w:szCs w:val="17"/>
-              </w:rPr>
-              <w:t xml:space="preserve">MB AxisPro seulement</w:t>
+              <w:t xml:space="preserve">test.porteur, porteur.demo</w:t>
             </w:r>
           </w:p>
         </w:tc>
@@ -938,7 +892,21 @@
           <w:sz w:val="20"/>
           <w:szCs w:val="20"/>
         </w:rPr>
-        <w:t xml:space="preserve">Les comptes ouverts à Finance et à AxisPro passent de l'une à l'autre par la bascule « Finance | AxisPro », en haut de la colonne de gauche. Les modules métier d'EGUITRA (transport, chantiers, immobilier) n'apparaissent que lorsque la société de travail est EGUITRA GROUP.</w:t>
+        <w:t xml:space="preserve">Sur la recette, le mot de passe est commun à tous les comptes et ne se modifie pas : une tentative de changement est refusée, c'est normal. Votre compte de test reste personnel pendant la campagne : si une autre personne doit tester, demandez-lui un compte.</w:t>
+      </w:r>
+    </w:p>
+    <w:p>
+      <w:pPr>
+        <w:spacing w:after="100"/>
+        <w:jc w:val="both"/>
+      </w:pPr>
+      <w:r>
+        <w:rPr>
+          <w:rFonts w:ascii="Calibri" w:cs="Calibri" w:eastAsia="Calibri" w:hAnsi="Calibri"/>
+          <w:sz w:val="20"/>
+          <w:szCs w:val="20"/>
+        </w:rPr>
+        <w:t xml:space="preserve">Double authentification : pendant la période de test, elle est désactivée sur la recette. Elle sera obligatoire sur la plateforme réelle : à la première connexion, vous installerez Google Authenticator ou Microsoft Authenticator sur votre téléphone, scannerez le code affiché, puis taperez à chaque connexion le code à 6 chiffres de l'application.</w:t>
       </w:r>
     </w:p>
     <w:p>
@@ -958,7 +926,21 @@
           <w:sz w:val="26"/>
           <w:szCs w:val="26"/>
         </w:rPr>
-        <w:t xml:space="preserve">3. Votre compte et ce que vous testez</w:t>
+        <w:t xml:space="preserve">2. Deux sociétés, plusieurs applications</w:t>
+      </w:r>
+    </w:p>
+    <w:p>
+      <w:pPr>
+        <w:spacing w:after="100"/>
+        <w:jc w:val="both"/>
+      </w:pPr>
+      <w:r>
+        <w:rPr>
+          <w:rFonts w:ascii="Calibri" w:cs="Calibri" w:eastAsia="Calibri" w:hAnsi="Calibri"/>
+          <w:sz w:val="20"/>
+          <w:szCs w:val="20"/>
+        </w:rPr>
+        <w:t xml:space="preserve">EGUITRA GROUP SARLU et MB AxisPro Consulting sont deux entreprises distinctes : chacune a sa comptabilité, ses clients, ses factures. La plateforme les sert par applications :</w:t>
       </w:r>
     </w:p>
     <w:tbl>
@@ -974,10 +956,9 @@
         </w:tblBorders>
       </w:tblPr>
       <w:tblGrid>
-        <w:gridCol w:w="1937"/>
-        <w:gridCol w:w="3309"/>
-        <w:gridCol w:w="2684"/>
-        <w:gridCol w:w="1708"/>
+        <w:gridCol w:w="2205"/>
+        <w:gridCol w:w="3768"/>
+        <w:gridCol w:w="3665"/>
       </w:tblGrid>
       <w:tr>
         <w:trPr>
@@ -985,7 +966,7 @@
         </w:trPr>
         <w:tc>
           <w:tcPr>
-            <w:tcW w:type="dxa" w:w="1937"/>
+            <w:tcW w:type="dxa" w:w="2205"/>
             <w:tcBorders>
               <w:top w:val="single" w:color="C9CFD8" w:sz="4"/>
               <w:left w:val="single" w:color="C9CFD8" w:sz="4"/>
@@ -1014,13 +995,13 @@
                 <w:sz w:val="17"/>
                 <w:szCs w:val="17"/>
               </w:rPr>
-              <w:t xml:space="preserve">Compte</w:t>
-            </w:r>
-          </w:p>
-        </w:tc>
-        <w:tc>
-          <w:tcPr>
-            <w:tcW w:type="dxa" w:w="3309"/>
+              <w:t xml:space="preserve">Application</w:t>
+            </w:r>
+          </w:p>
+        </w:tc>
+        <w:tc>
+          <w:tcPr>
+            <w:tcW w:type="dxa" w:w="3768"/>
             <w:tcBorders>
               <w:top w:val="single" w:color="C9CFD8" w:sz="4"/>
               <w:left w:val="single" w:color="C9CFD8" w:sz="4"/>
@@ -1049,13 +1030,13 @@
                 <w:sz w:val="17"/>
                 <w:szCs w:val="17"/>
               </w:rPr>
-              <w:t xml:space="preserve">Métier</w:t>
-            </w:r>
-          </w:p>
-        </w:tc>
-        <w:tc>
-          <w:tcPr>
-            <w:tcW w:type="dxa" w:w="2684"/>
+              <w:t xml:space="preserve">Pour qui</w:t>
+            </w:r>
+          </w:p>
+        </w:tc>
+        <w:tc>
+          <w:tcPr>
+            <w:tcW w:type="dxa" w:w="3665"/>
             <w:tcBorders>
               <w:top w:val="single" w:color="C9CFD8" w:sz="4"/>
               <w:left w:val="single" w:color="C9CFD8" w:sz="4"/>
@@ -1084,13 +1065,750 @@
                 <w:sz w:val="17"/>
                 <w:szCs w:val="17"/>
               </w:rPr>
-              <w:t xml:space="preserve">Applications</w:t>
-            </w:r>
-          </w:p>
-        </w:tc>
-        <w:tc>
-          <w:tcPr>
-            <w:tcW w:type="dxa" w:w="1708"/>
+              <w:t xml:space="preserve">Société</w:t>
+            </w:r>
+          </w:p>
+        </w:tc>
+      </w:tr>
+      <w:tr>
+        <w:tc>
+          <w:tcPr>
+            <w:tcW w:type="dxa" w:w="2205"/>
+            <w:tcBorders>
+              <w:top w:val="single" w:color="C9CFD8" w:sz="4"/>
+              <w:left w:val="single" w:color="C9CFD8" w:sz="4"/>
+              <w:bottom w:val="single" w:color="C9CFD8" w:sz="4"/>
+              <w:right w:val="single" w:color="C9CFD8" w:sz="4"/>
+            </w:tcBorders>
+            <w:tcMar>
+              <w:top w:type="dxa" w:w="50"/>
+              <w:left w:type="dxa" w:w="90"/>
+              <w:bottom w:type="dxa" w:w="50"/>
+              <w:right w:type="dxa" w:w="90"/>
+            </w:tcMar>
+            <w:vAlign w:val="center"/>
+          </w:tcPr>
+          <w:p>
+            <w:pPr>
+              <w:spacing w:after="0"/>
+            </w:pPr>
+            <w:r>
+              <w:rPr>
+                <w:rFonts w:ascii="Calibri" w:cs="Calibri" w:eastAsia="Calibri" w:hAnsi="Calibri"/>
+                <w:sz w:val="17"/>
+                <w:szCs w:val="17"/>
+              </w:rPr>
+              <w:t xml:space="preserve">NIMOVA · Finance</w:t>
+            </w:r>
+          </w:p>
+        </w:tc>
+        <w:tc>
+          <w:tcPr>
+            <w:tcW w:type="dxa" w:w="3768"/>
+            <w:tcBorders>
+              <w:top w:val="single" w:color="C9CFD8" w:sz="4"/>
+              <w:left w:val="single" w:color="C9CFD8" w:sz="4"/>
+              <w:bottom w:val="single" w:color="C9CFD8" w:sz="4"/>
+              <w:right w:val="single" w:color="C9CFD8" w:sz="4"/>
+            </w:tcBorders>
+            <w:tcMar>
+              <w:top w:type="dxa" w:w="50"/>
+              <w:left w:type="dxa" w:w="90"/>
+              <w:bottom w:type="dxa" w:w="50"/>
+              <w:right w:type="dxa" w:w="90"/>
+            </w:tcMar>
+            <w:vAlign w:val="center"/>
+          </w:tcPr>
+          <w:p>
+            <w:pPr>
+              <w:spacing w:after="0"/>
+            </w:pPr>
+            <w:r>
+              <w:rPr>
+                <w:rFonts w:ascii="Calibri" w:cs="Calibri" w:eastAsia="Calibri" w:hAnsi="Calibri"/>
+                <w:sz w:val="17"/>
+                <w:szCs w:val="17"/>
+              </w:rPr>
+              <w:t xml:space="preserve">Direction, finance, achats, métiers d'EGUITRA</w:t>
+            </w:r>
+          </w:p>
+        </w:tc>
+        <w:tc>
+          <w:tcPr>
+            <w:tcW w:type="dxa" w:w="3665"/>
+            <w:tcBorders>
+              <w:top w:val="single" w:color="C9CFD8" w:sz="4"/>
+              <w:left w:val="single" w:color="C9CFD8" w:sz="4"/>
+              <w:bottom w:val="single" w:color="C9CFD8" w:sz="4"/>
+              <w:right w:val="single" w:color="C9CFD8" w:sz="4"/>
+            </w:tcBorders>
+            <w:tcMar>
+              <w:top w:type="dxa" w:w="50"/>
+              <w:left w:type="dxa" w:w="90"/>
+              <w:bottom w:type="dxa" w:w="50"/>
+              <w:right w:type="dxa" w:w="90"/>
+            </w:tcMar>
+            <w:vAlign w:val="center"/>
+          </w:tcPr>
+          <w:p>
+            <w:pPr>
+              <w:spacing w:after="0"/>
+            </w:pPr>
+            <w:r>
+              <w:rPr>
+                <w:rFonts w:ascii="Calibri" w:cs="Calibri" w:eastAsia="Calibri" w:hAnsi="Calibri"/>
+                <w:sz w:val="17"/>
+                <w:szCs w:val="17"/>
+              </w:rPr>
+              <w:t xml:space="preserve">Les deux, séparément : la société de travail se choisit en haut à droite</w:t>
+            </w:r>
+          </w:p>
+        </w:tc>
+      </w:tr>
+      <w:tr>
+        <w:tc>
+          <w:tcPr>
+            <w:tcW w:type="dxa" w:w="2205"/>
+            <w:tcBorders>
+              <w:top w:val="single" w:color="C9CFD8" w:sz="4"/>
+              <w:left w:val="single" w:color="C9CFD8" w:sz="4"/>
+              <w:bottom w:val="single" w:color="C9CFD8" w:sz="4"/>
+              <w:right w:val="single" w:color="C9CFD8" w:sz="4"/>
+            </w:tcBorders>
+            <w:shd w:fill="F2F4F7" w:color="auto" w:val="clear"/>
+            <w:tcMar>
+              <w:top w:type="dxa" w:w="50"/>
+              <w:left w:type="dxa" w:w="90"/>
+              <w:bottom w:type="dxa" w:w="50"/>
+              <w:right w:type="dxa" w:w="90"/>
+            </w:tcMar>
+            <w:vAlign w:val="center"/>
+          </w:tcPr>
+          <w:p>
+            <w:pPr>
+              <w:spacing w:after="0"/>
+            </w:pPr>
+            <w:r>
+              <w:rPr>
+                <w:rFonts w:ascii="Calibri" w:cs="Calibri" w:eastAsia="Calibri" w:hAnsi="Calibri"/>
+                <w:sz w:val="17"/>
+                <w:szCs w:val="17"/>
+              </w:rPr>
+              <w:t xml:space="preserve">NIMOVA · Transport</w:t>
+            </w:r>
+          </w:p>
+        </w:tc>
+        <w:tc>
+          <w:tcPr>
+            <w:tcW w:type="dxa" w:w="3768"/>
+            <w:tcBorders>
+              <w:top w:val="single" w:color="C9CFD8" w:sz="4"/>
+              <w:left w:val="single" w:color="C9CFD8" w:sz="4"/>
+              <w:bottom w:val="single" w:color="C9CFD8" w:sz="4"/>
+              <w:right w:val="single" w:color="C9CFD8" w:sz="4"/>
+            </w:tcBorders>
+            <w:shd w:fill="F2F4F7" w:color="auto" w:val="clear"/>
+            <w:tcMar>
+              <w:top w:type="dxa" w:w="50"/>
+              <w:left w:type="dxa" w:w="90"/>
+              <w:bottom w:type="dxa" w:w="50"/>
+              <w:right w:type="dxa" w:w="90"/>
+            </w:tcMar>
+            <w:vAlign w:val="center"/>
+          </w:tcPr>
+          <w:p>
+            <w:pPr>
+              <w:spacing w:after="0"/>
+            </w:pPr>
+            <w:r>
+              <w:rPr>
+                <w:rFonts w:ascii="Calibri" w:cs="Calibri" w:eastAsia="Calibri" w:hAnsi="Calibri"/>
+                <w:sz w:val="17"/>
+                <w:szCs w:val="17"/>
+              </w:rPr>
+              <w:t xml:space="preserve">Direction, finance, exploitation</w:t>
+            </w:r>
+          </w:p>
+        </w:tc>
+        <w:tc>
+          <w:tcPr>
+            <w:tcW w:type="dxa" w:w="3665"/>
+            <w:tcBorders>
+              <w:top w:val="single" w:color="C9CFD8" w:sz="4"/>
+              <w:left w:val="single" w:color="C9CFD8" w:sz="4"/>
+              <w:bottom w:val="single" w:color="C9CFD8" w:sz="4"/>
+              <w:right w:val="single" w:color="C9CFD8" w:sz="4"/>
+            </w:tcBorders>
+            <w:shd w:fill="F2F4F7" w:color="auto" w:val="clear"/>
+            <w:tcMar>
+              <w:top w:type="dxa" w:w="50"/>
+              <w:left w:type="dxa" w:w="90"/>
+              <w:bottom w:type="dxa" w:w="50"/>
+              <w:right w:type="dxa" w:w="90"/>
+            </w:tcMar>
+            <w:vAlign w:val="center"/>
+          </w:tcPr>
+          <w:p>
+            <w:pPr>
+              <w:spacing w:after="0"/>
+            </w:pPr>
+            <w:r>
+              <w:rPr>
+                <w:rFonts w:ascii="Calibri" w:cs="Calibri" w:eastAsia="Calibri" w:hAnsi="Calibri"/>
+                <w:sz w:val="17"/>
+                <w:szCs w:val="17"/>
+              </w:rPr>
+              <w:t xml:space="preserve">EGUITRA GROUP SARLU seulement</w:t>
+            </w:r>
+          </w:p>
+        </w:tc>
+      </w:tr>
+      <w:tr>
+        <w:tc>
+          <w:tcPr>
+            <w:tcW w:type="dxa" w:w="2205"/>
+            <w:tcBorders>
+              <w:top w:val="single" w:color="C9CFD8" w:sz="4"/>
+              <w:left w:val="single" w:color="C9CFD8" w:sz="4"/>
+              <w:bottom w:val="single" w:color="C9CFD8" w:sz="4"/>
+              <w:right w:val="single" w:color="C9CFD8" w:sz="4"/>
+            </w:tcBorders>
+            <w:tcMar>
+              <w:top w:type="dxa" w:w="50"/>
+              <w:left w:type="dxa" w:w="90"/>
+              <w:bottom w:type="dxa" w:w="50"/>
+              <w:right w:type="dxa" w:w="90"/>
+            </w:tcMar>
+            <w:vAlign w:val="center"/>
+          </w:tcPr>
+          <w:p>
+            <w:pPr>
+              <w:spacing w:after="0"/>
+            </w:pPr>
+            <w:r>
+              <w:rPr>
+                <w:rFonts w:ascii="Calibri" w:cs="Calibri" w:eastAsia="Calibri" w:hAnsi="Calibri"/>
+                <w:sz w:val="17"/>
+                <w:szCs w:val="17"/>
+              </w:rPr>
+              <w:t xml:space="preserve">NIMOVA · MB AxisPro Consulting</w:t>
+            </w:r>
+          </w:p>
+        </w:tc>
+        <w:tc>
+          <w:tcPr>
+            <w:tcW w:type="dxa" w:w="3768"/>
+            <w:tcBorders>
+              <w:top w:val="single" w:color="C9CFD8" w:sz="4"/>
+              <w:left w:val="single" w:color="C9CFD8" w:sz="4"/>
+              <w:bottom w:val="single" w:color="C9CFD8" w:sz="4"/>
+              <w:right w:val="single" w:color="C9CFD8" w:sz="4"/>
+            </w:tcBorders>
+            <w:tcMar>
+              <w:top w:type="dxa" w:w="50"/>
+              <w:left w:type="dxa" w:w="90"/>
+              <w:bottom w:type="dxa" w:w="50"/>
+              <w:right w:type="dxa" w:w="90"/>
+            </w:tcMar>
+            <w:vAlign w:val="center"/>
+          </w:tcPr>
+          <w:p>
+            <w:pPr>
+              <w:spacing w:after="0"/>
+            </w:pPr>
+            <w:r>
+              <w:rPr>
+                <w:rFonts w:ascii="Calibri" w:cs="Calibri" w:eastAsia="Calibri" w:hAnsi="Calibri"/>
+                <w:sz w:val="17"/>
+                <w:szCs w:val="17"/>
+              </w:rPr>
+              <w:t xml:space="preserve">Direction, consultants du cabinet</w:t>
+            </w:r>
+          </w:p>
+        </w:tc>
+        <w:tc>
+          <w:tcPr>
+            <w:tcW w:type="dxa" w:w="3665"/>
+            <w:tcBorders>
+              <w:top w:val="single" w:color="C9CFD8" w:sz="4"/>
+              <w:left w:val="single" w:color="C9CFD8" w:sz="4"/>
+              <w:bottom w:val="single" w:color="C9CFD8" w:sz="4"/>
+              <w:right w:val="single" w:color="C9CFD8" w:sz="4"/>
+            </w:tcBorders>
+            <w:tcMar>
+              <w:top w:type="dxa" w:w="50"/>
+              <w:left w:type="dxa" w:w="90"/>
+              <w:bottom w:type="dxa" w:w="50"/>
+              <w:right w:type="dxa" w:w="90"/>
+            </w:tcMar>
+            <w:vAlign w:val="center"/>
+          </w:tcPr>
+          <w:p>
+            <w:pPr>
+              <w:spacing w:after="0"/>
+            </w:pPr>
+            <w:r>
+              <w:rPr>
+                <w:rFonts w:ascii="Calibri" w:cs="Calibri" w:eastAsia="Calibri" w:hAnsi="Calibri"/>
+                <w:sz w:val="17"/>
+                <w:szCs w:val="17"/>
+              </w:rPr>
+              <w:t xml:space="preserve">MB AxisPro Consulting seulement</w:t>
+            </w:r>
+          </w:p>
+        </w:tc>
+      </w:tr>
+      <w:tr>
+        <w:tc>
+          <w:tcPr>
+            <w:tcW w:type="dxa" w:w="2205"/>
+            <w:tcBorders>
+              <w:top w:val="single" w:color="C9CFD8" w:sz="4"/>
+              <w:left w:val="single" w:color="C9CFD8" w:sz="4"/>
+              <w:bottom w:val="single" w:color="C9CFD8" w:sz="4"/>
+              <w:right w:val="single" w:color="C9CFD8" w:sz="4"/>
+            </w:tcBorders>
+            <w:shd w:fill="F2F4F7" w:color="auto" w:val="clear"/>
+            <w:tcMar>
+              <w:top w:type="dxa" w:w="50"/>
+              <w:left w:type="dxa" w:w="90"/>
+              <w:bottom w:type="dxa" w:w="50"/>
+              <w:right w:type="dxa" w:w="90"/>
+            </w:tcMar>
+            <w:vAlign w:val="center"/>
+          </w:tcPr>
+          <w:p>
+            <w:pPr>
+              <w:spacing w:after="0"/>
+            </w:pPr>
+            <w:r>
+              <w:rPr>
+                <w:rFonts w:ascii="Calibri" w:cs="Calibri" w:eastAsia="Calibri" w:hAnsi="Calibri"/>
+                <w:sz w:val="17"/>
+                <w:szCs w:val="17"/>
+              </w:rPr>
+              <w:t xml:space="preserve">NIMOVA · Analyse</w:t>
+            </w:r>
+          </w:p>
+        </w:tc>
+        <w:tc>
+          <w:tcPr>
+            <w:tcW w:type="dxa" w:w="3768"/>
+            <w:tcBorders>
+              <w:top w:val="single" w:color="C9CFD8" w:sz="4"/>
+              <w:left w:val="single" w:color="C9CFD8" w:sz="4"/>
+              <w:bottom w:val="single" w:color="C9CFD8" w:sz="4"/>
+              <w:right w:val="single" w:color="C9CFD8" w:sz="4"/>
+            </w:tcBorders>
+            <w:shd w:fill="F2F4F7" w:color="auto" w:val="clear"/>
+            <w:tcMar>
+              <w:top w:type="dxa" w:w="50"/>
+              <w:left w:type="dxa" w:w="90"/>
+              <w:bottom w:type="dxa" w:w="50"/>
+              <w:right w:type="dxa" w:w="90"/>
+            </w:tcMar>
+            <w:vAlign w:val="center"/>
+          </w:tcPr>
+          <w:p>
+            <w:pPr>
+              <w:spacing w:after="0"/>
+            </w:pPr>
+            <w:r>
+              <w:rPr>
+                <w:rFonts w:ascii="Calibri" w:cs="Calibri" w:eastAsia="Calibri" w:hAnsi="Calibri"/>
+                <w:sz w:val="17"/>
+                <w:szCs w:val="17"/>
+              </w:rPr>
+              <w:t xml:space="preserve">Direction, finance, cabinet</w:t>
+            </w:r>
+          </w:p>
+        </w:tc>
+        <w:tc>
+          <w:tcPr>
+            <w:tcW w:type="dxa" w:w="3665"/>
+            <w:tcBorders>
+              <w:top w:val="single" w:color="C9CFD8" w:sz="4"/>
+              <w:left w:val="single" w:color="C9CFD8" w:sz="4"/>
+              <w:bottom w:val="single" w:color="C9CFD8" w:sz="4"/>
+              <w:right w:val="single" w:color="C9CFD8" w:sz="4"/>
+            </w:tcBorders>
+            <w:shd w:fill="F2F4F7" w:color="auto" w:val="clear"/>
+            <w:tcMar>
+              <w:top w:type="dxa" w:w="50"/>
+              <w:left w:type="dxa" w:w="90"/>
+              <w:bottom w:type="dxa" w:w="50"/>
+              <w:right w:type="dxa" w:w="90"/>
+            </w:tcMar>
+            <w:vAlign w:val="center"/>
+          </w:tcPr>
+          <w:p>
+            <w:pPr>
+              <w:spacing w:after="0"/>
+            </w:pPr>
+            <w:r>
+              <w:rPr>
+                <w:rFonts w:ascii="Calibri" w:cs="Calibri" w:eastAsia="Calibri" w:hAnsi="Calibri"/>
+                <w:sz w:val="17"/>
+                <w:szCs w:val="17"/>
+              </w:rPr>
+              <w:t xml:space="preserve">Selon la société de travail</w:t>
+            </w:r>
+          </w:p>
+        </w:tc>
+      </w:tr>
+      <w:tr>
+        <w:tc>
+          <w:tcPr>
+            <w:tcW w:type="dxa" w:w="2205"/>
+            <w:tcBorders>
+              <w:top w:val="single" w:color="C9CFD8" w:sz="4"/>
+              <w:left w:val="single" w:color="C9CFD8" w:sz="4"/>
+              <w:bottom w:val="single" w:color="C9CFD8" w:sz="4"/>
+              <w:right w:val="single" w:color="C9CFD8" w:sz="4"/>
+            </w:tcBorders>
+            <w:tcMar>
+              <w:top w:type="dxa" w:w="50"/>
+              <w:left w:type="dxa" w:w="90"/>
+              <w:bottom w:type="dxa" w:w="50"/>
+              <w:right w:type="dxa" w:w="90"/>
+            </w:tcMar>
+            <w:vAlign w:val="center"/>
+          </w:tcPr>
+          <w:p>
+            <w:pPr>
+              <w:spacing w:after="0"/>
+            </w:pPr>
+            <w:r>
+              <w:rPr>
+                <w:rFonts w:ascii="Calibri" w:cs="Calibri" w:eastAsia="Calibri" w:hAnsi="Calibri"/>
+                <w:sz w:val="17"/>
+                <w:szCs w:val="17"/>
+              </w:rPr>
+              <w:t xml:space="preserve">NIMOVA · RH</w:t>
+            </w:r>
+          </w:p>
+        </w:tc>
+        <w:tc>
+          <w:tcPr>
+            <w:tcW w:type="dxa" w:w="3768"/>
+            <w:tcBorders>
+              <w:top w:val="single" w:color="C9CFD8" w:sz="4"/>
+              <w:left w:val="single" w:color="C9CFD8" w:sz="4"/>
+              <w:bottom w:val="single" w:color="C9CFD8" w:sz="4"/>
+              <w:right w:val="single" w:color="C9CFD8" w:sz="4"/>
+            </w:tcBorders>
+            <w:tcMar>
+              <w:top w:type="dxa" w:w="50"/>
+              <w:left w:type="dxa" w:w="90"/>
+              <w:bottom w:type="dxa" w:w="50"/>
+              <w:right w:type="dxa" w:w="90"/>
+            </w:tcMar>
+            <w:vAlign w:val="center"/>
+          </w:tcPr>
+          <w:p>
+            <w:pPr>
+              <w:spacing w:after="0"/>
+            </w:pPr>
+            <w:r>
+              <w:rPr>
+                <w:rFonts w:ascii="Calibri" w:cs="Calibri" w:eastAsia="Calibri" w:hAnsi="Calibri"/>
+                <w:sz w:val="17"/>
+                <w:szCs w:val="17"/>
+              </w:rPr>
+              <w:t xml:space="preserve">Direction, ressources humaines ; « Mon espace » pour chaque salarié</w:t>
+            </w:r>
+          </w:p>
+        </w:tc>
+        <w:tc>
+          <w:tcPr>
+            <w:tcW w:type="dxa" w:w="3665"/>
+            <w:tcBorders>
+              <w:top w:val="single" w:color="C9CFD8" w:sz="4"/>
+              <w:left w:val="single" w:color="C9CFD8" w:sz="4"/>
+              <w:bottom w:val="single" w:color="C9CFD8" w:sz="4"/>
+              <w:right w:val="single" w:color="C9CFD8" w:sz="4"/>
+            </w:tcBorders>
+            <w:tcMar>
+              <w:top w:type="dxa" w:w="50"/>
+              <w:left w:type="dxa" w:w="90"/>
+              <w:bottom w:type="dxa" w:w="50"/>
+              <w:right w:type="dxa" w:w="90"/>
+            </w:tcMar>
+            <w:vAlign w:val="center"/>
+          </w:tcPr>
+          <w:p>
+            <w:pPr>
+              <w:spacing w:after="0"/>
+            </w:pPr>
+            <w:r>
+              <w:rPr>
+                <w:rFonts w:ascii="Calibri" w:cs="Calibri" w:eastAsia="Calibri" w:hAnsi="Calibri"/>
+                <w:sz w:val="17"/>
+                <w:szCs w:val="17"/>
+              </w:rPr>
+              <w:t xml:space="preserve">Les deux, gestion commune</w:t>
+            </w:r>
+          </w:p>
+        </w:tc>
+      </w:tr>
+      <w:tr>
+        <w:tc>
+          <w:tcPr>
+            <w:tcW w:type="dxa" w:w="2205"/>
+            <w:tcBorders>
+              <w:top w:val="single" w:color="C9CFD8" w:sz="4"/>
+              <w:left w:val="single" w:color="C9CFD8" w:sz="4"/>
+              <w:bottom w:val="single" w:color="C9CFD8" w:sz="4"/>
+              <w:right w:val="single" w:color="C9CFD8" w:sz="4"/>
+            </w:tcBorders>
+            <w:shd w:fill="F2F4F7" w:color="auto" w:val="clear"/>
+            <w:tcMar>
+              <w:top w:type="dxa" w:w="50"/>
+              <w:left w:type="dxa" w:w="90"/>
+              <w:bottom w:type="dxa" w:w="50"/>
+              <w:right w:type="dxa" w:w="90"/>
+            </w:tcMar>
+            <w:vAlign w:val="center"/>
+          </w:tcPr>
+          <w:p>
+            <w:pPr>
+              <w:spacing w:after="0"/>
+            </w:pPr>
+            <w:r>
+              <w:rPr>
+                <w:rFonts w:ascii="Calibri" w:cs="Calibri" w:eastAsia="Calibri" w:hAnsi="Calibri"/>
+                <w:sz w:val="17"/>
+                <w:szCs w:val="17"/>
+              </w:rPr>
+              <w:t xml:space="preserve">NIMOVA · Rotations</w:t>
+            </w:r>
+          </w:p>
+        </w:tc>
+        <w:tc>
+          <w:tcPr>
+            <w:tcW w:type="dxa" w:w="3768"/>
+            <w:tcBorders>
+              <w:top w:val="single" w:color="C9CFD8" w:sz="4"/>
+              <w:left w:val="single" w:color="C9CFD8" w:sz="4"/>
+              <w:bottom w:val="single" w:color="C9CFD8" w:sz="4"/>
+              <w:right w:val="single" w:color="C9CFD8" w:sz="4"/>
+            </w:tcBorders>
+            <w:shd w:fill="F2F4F7" w:color="auto" w:val="clear"/>
+            <w:tcMar>
+              <w:top w:type="dxa" w:w="50"/>
+              <w:left w:type="dxa" w:w="90"/>
+              <w:bottom w:type="dxa" w:w="50"/>
+              <w:right w:type="dxa" w:w="90"/>
+            </w:tcMar>
+            <w:vAlign w:val="center"/>
+          </w:tcPr>
+          <w:p>
+            <w:pPr>
+              <w:spacing w:after="0"/>
+            </w:pPr>
+            <w:r>
+              <w:rPr>
+                <w:rFonts w:ascii="Calibri" w:cs="Calibri" w:eastAsia="Calibri" w:hAnsi="Calibri"/>
+                <w:sz w:val="17"/>
+                <w:szCs w:val="17"/>
+              </w:rPr>
+              <w:t xml:space="preserve">Exploitation, agents de parc</w:t>
+            </w:r>
+          </w:p>
+        </w:tc>
+        <w:tc>
+          <w:tcPr>
+            <w:tcW w:type="dxa" w:w="3665"/>
+            <w:tcBorders>
+              <w:top w:val="single" w:color="C9CFD8" w:sz="4"/>
+              <w:left w:val="single" w:color="C9CFD8" w:sz="4"/>
+              <w:bottom w:val="single" w:color="C9CFD8" w:sz="4"/>
+              <w:right w:val="single" w:color="C9CFD8" w:sz="4"/>
+            </w:tcBorders>
+            <w:shd w:fill="F2F4F7" w:color="auto" w:val="clear"/>
+            <w:tcMar>
+              <w:top w:type="dxa" w:w="50"/>
+              <w:left w:type="dxa" w:w="90"/>
+              <w:bottom w:type="dxa" w:w="50"/>
+              <w:right w:type="dxa" w:w="90"/>
+            </w:tcMar>
+            <w:vAlign w:val="center"/>
+          </w:tcPr>
+          <w:p>
+            <w:pPr>
+              <w:spacing w:after="0"/>
+            </w:pPr>
+            <w:r>
+              <w:rPr>
+                <w:rFonts w:ascii="Calibri" w:cs="Calibri" w:eastAsia="Calibri" w:hAnsi="Calibri"/>
+                <w:sz w:val="17"/>
+                <w:szCs w:val="17"/>
+              </w:rPr>
+              <w:t xml:space="preserve">EGUITRA GROUP SARLU seulement</w:t>
+            </w:r>
+          </w:p>
+        </w:tc>
+      </w:tr>
+      <w:tr>
+        <w:tc>
+          <w:tcPr>
+            <w:tcW w:type="dxa" w:w="2205"/>
+            <w:tcBorders>
+              <w:top w:val="single" w:color="C9CFD8" w:sz="4"/>
+              <w:left w:val="single" w:color="C9CFD8" w:sz="4"/>
+              <w:bottom w:val="single" w:color="C9CFD8" w:sz="4"/>
+              <w:right w:val="single" w:color="C9CFD8" w:sz="4"/>
+            </w:tcBorders>
+            <w:tcMar>
+              <w:top w:type="dxa" w:w="50"/>
+              <w:left w:type="dxa" w:w="90"/>
+              <w:bottom w:type="dxa" w:w="50"/>
+              <w:right w:type="dxa" w:w="90"/>
+            </w:tcMar>
+            <w:vAlign w:val="center"/>
+          </w:tcPr>
+          <w:p>
+            <w:pPr>
+              <w:spacing w:after="0"/>
+            </w:pPr>
+            <w:r>
+              <w:rPr>
+                <w:rFonts w:ascii="Calibri" w:cs="Calibri" w:eastAsia="Calibri" w:hAnsi="Calibri"/>
+                <w:sz w:val="17"/>
+                <w:szCs w:val="17"/>
+              </w:rPr>
+              <w:t xml:space="preserve">Portail des porteurs de projets</w:t>
+            </w:r>
+          </w:p>
+        </w:tc>
+        <w:tc>
+          <w:tcPr>
+            <w:tcW w:type="dxa" w:w="3768"/>
+            <w:tcBorders>
+              <w:top w:val="single" w:color="C9CFD8" w:sz="4"/>
+              <w:left w:val="single" w:color="C9CFD8" w:sz="4"/>
+              <w:bottom w:val="single" w:color="C9CFD8" w:sz="4"/>
+              <w:right w:val="single" w:color="C9CFD8" w:sz="4"/>
+            </w:tcBorders>
+            <w:tcMar>
+              <w:top w:type="dxa" w:w="50"/>
+              <w:left w:type="dxa" w:w="90"/>
+              <w:bottom w:type="dxa" w:w="50"/>
+              <w:right w:type="dxa" w:w="90"/>
+            </w:tcMar>
+            <w:vAlign w:val="center"/>
+          </w:tcPr>
+          <w:p>
+            <w:pPr>
+              <w:spacing w:after="0"/>
+            </w:pPr>
+            <w:r>
+              <w:rPr>
+                <w:rFonts w:ascii="Calibri" w:cs="Calibri" w:eastAsia="Calibri" w:hAnsi="Calibri"/>
+                <w:sz w:val="17"/>
+                <w:szCs w:val="17"/>
+              </w:rPr>
+              <w:t xml:space="preserve">Clients du cabinet</w:t>
+            </w:r>
+          </w:p>
+        </w:tc>
+        <w:tc>
+          <w:tcPr>
+            <w:tcW w:type="dxa" w:w="3665"/>
+            <w:tcBorders>
+              <w:top w:val="single" w:color="C9CFD8" w:sz="4"/>
+              <w:left w:val="single" w:color="C9CFD8" w:sz="4"/>
+              <w:bottom w:val="single" w:color="C9CFD8" w:sz="4"/>
+              <w:right w:val="single" w:color="C9CFD8" w:sz="4"/>
+            </w:tcBorders>
+            <w:tcMar>
+              <w:top w:type="dxa" w:w="50"/>
+              <w:left w:type="dxa" w:w="90"/>
+              <w:bottom w:type="dxa" w:w="50"/>
+              <w:right w:type="dxa" w:w="90"/>
+            </w:tcMar>
+            <w:vAlign w:val="center"/>
+          </w:tcPr>
+          <w:p>
+            <w:pPr>
+              <w:spacing w:after="0"/>
+            </w:pPr>
+            <w:r>
+              <w:rPr>
+                <w:rFonts w:ascii="Calibri" w:cs="Calibri" w:eastAsia="Calibri" w:hAnsi="Calibri"/>
+                <w:sz w:val="17"/>
+                <w:szCs w:val="17"/>
+              </w:rPr>
+              <w:t xml:space="preserve">MB AxisPro Consulting seulement</w:t>
+            </w:r>
+          </w:p>
+        </w:tc>
+      </w:tr>
+    </w:tbl>
+    <w:p>
+      <w:pPr>
+        <w:spacing w:after="80"/>
+      </w:pPr>
+    </w:p>
+    <w:p>
+      <w:pPr>
+        <w:spacing w:after="100"/>
+        <w:jc w:val="both"/>
+      </w:pPr>
+      <w:r>
+        <w:rPr>
+          <w:rFonts w:ascii="Calibri" w:cs="Calibri" w:eastAsia="Calibri" w:hAnsi="Calibri"/>
+          <w:sz w:val="20"/>
+          <w:szCs w:val="20"/>
+        </w:rPr>
+        <w:t xml:space="preserve">Un compte ouvert à plusieurs applications passe de l'une à l'autre par le nom de l'espace, en haut à gauche (NIMOVA, puis le nom du module), ou par l'accueil NIMOVA. Les modules métier d'EGUITRA (BTP, immobilier) n'apparaissent que lorsque la société de travail est EGUITRA GROUP SARLU.</w:t>
+      </w:r>
+    </w:p>
+    <w:p>
+      <w:pPr>
+        <w:keepNext/>
+        <w:pBdr>
+          <w:bottom w:val="single" w:color="1A9E9E" w:sz="6" w:space="2"/>
+        </w:pBdr>
+        <w:spacing w:after="100" w:before="280"/>
+      </w:pPr>
+      <w:r>
+        <w:rPr>
+          <w:rFonts w:ascii="Calibri" w:cs="Calibri" w:eastAsia="Calibri" w:hAnsi="Calibri"/>
+          <w:b/>
+          <w:bCs/>
+          <w:color w:val="1C1E6B"/>
+          <w:sz w:val="26"/>
+          <w:szCs w:val="26"/>
+        </w:rPr>
+        <w:t xml:space="preserve">3. Votre compte et ce que vous testez</w:t>
+      </w:r>
+    </w:p>
+    <w:tbl>
+      <w:tblPr>
+        <w:tblW w:type="dxa" w:w="9638"/>
+        <w:tblBorders>
+          <w:top w:val="single" w:color="auto" w:sz="4"/>
+          <w:left w:val="single" w:color="auto" w:sz="4"/>
+          <w:bottom w:val="single" w:color="auto" w:sz="4"/>
+          <w:right w:val="single" w:color="auto" w:sz="4"/>
+          <w:insideH w:val="single" w:color="auto" w:sz="4"/>
+          <w:insideV w:val="single" w:color="auto" w:sz="4"/>
+        </w:tblBorders>
+      </w:tblPr>
+      <w:tblGrid>
+        <w:gridCol w:w="1748"/>
+        <w:gridCol w:w="2906"/>
+        <w:gridCol w:w="3082"/>
+        <w:gridCol w:w="1903"/>
+      </w:tblGrid>
+      <w:tr>
+        <w:trPr>
+          <w:tblHeader/>
+        </w:trPr>
+        <w:tc>
+          <w:tcPr>
+            <w:tcW w:type="dxa" w:w="1748"/>
             <w:tcBorders>
               <w:top w:val="single" w:color="C9CFD8" w:sz="4"/>
               <w:left w:val="single" w:color="C9CFD8" w:sz="4"/>
@@ -1119,6 +1837,111 @@
                 <w:sz w:val="17"/>
                 <w:szCs w:val="17"/>
               </w:rPr>
+              <w:t xml:space="preserve">Compte</w:t>
+            </w:r>
+          </w:p>
+        </w:tc>
+        <w:tc>
+          <w:tcPr>
+            <w:tcW w:type="dxa" w:w="2906"/>
+            <w:tcBorders>
+              <w:top w:val="single" w:color="C9CFD8" w:sz="4"/>
+              <w:left w:val="single" w:color="C9CFD8" w:sz="4"/>
+              <w:bottom w:val="single" w:color="C9CFD8" w:sz="4"/>
+              <w:right w:val="single" w:color="C9CFD8" w:sz="4"/>
+            </w:tcBorders>
+            <w:shd w:fill="1C1E6B" w:color="auto" w:val="clear"/>
+            <w:tcMar>
+              <w:top w:type="dxa" w:w="50"/>
+              <w:left w:type="dxa" w:w="90"/>
+              <w:bottom w:type="dxa" w:w="50"/>
+              <w:right w:type="dxa" w:w="90"/>
+            </w:tcMar>
+            <w:vAlign w:val="center"/>
+          </w:tcPr>
+          <w:p>
+            <w:pPr>
+              <w:spacing w:after="0"/>
+            </w:pPr>
+            <w:r>
+              <w:rPr>
+                <w:rFonts w:ascii="Calibri" w:cs="Calibri" w:eastAsia="Calibri" w:hAnsi="Calibri"/>
+                <w:b/>
+                <w:bCs/>
+                <w:color w:val="FFFFFF"/>
+                <w:sz w:val="17"/>
+                <w:szCs w:val="17"/>
+              </w:rPr>
+              <w:t xml:space="preserve">Métier</w:t>
+            </w:r>
+          </w:p>
+        </w:tc>
+        <w:tc>
+          <w:tcPr>
+            <w:tcW w:type="dxa" w:w="3082"/>
+            <w:tcBorders>
+              <w:top w:val="single" w:color="C9CFD8" w:sz="4"/>
+              <w:left w:val="single" w:color="C9CFD8" w:sz="4"/>
+              <w:bottom w:val="single" w:color="C9CFD8" w:sz="4"/>
+              <w:right w:val="single" w:color="C9CFD8" w:sz="4"/>
+            </w:tcBorders>
+            <w:shd w:fill="1C1E6B" w:color="auto" w:val="clear"/>
+            <w:tcMar>
+              <w:top w:type="dxa" w:w="50"/>
+              <w:left w:type="dxa" w:w="90"/>
+              <w:bottom w:type="dxa" w:w="50"/>
+              <w:right w:type="dxa" w:w="90"/>
+            </w:tcMar>
+            <w:vAlign w:val="center"/>
+          </w:tcPr>
+          <w:p>
+            <w:pPr>
+              <w:spacing w:after="0"/>
+            </w:pPr>
+            <w:r>
+              <w:rPr>
+                <w:rFonts w:ascii="Calibri" w:cs="Calibri" w:eastAsia="Calibri" w:hAnsi="Calibri"/>
+                <w:b/>
+                <w:bCs/>
+                <w:color w:val="FFFFFF"/>
+                <w:sz w:val="17"/>
+                <w:szCs w:val="17"/>
+              </w:rPr>
+              <w:t xml:space="preserve">Applications</w:t>
+            </w:r>
+          </w:p>
+        </w:tc>
+        <w:tc>
+          <w:tcPr>
+            <w:tcW w:type="dxa" w:w="1903"/>
+            <w:tcBorders>
+              <w:top w:val="single" w:color="C9CFD8" w:sz="4"/>
+              <w:left w:val="single" w:color="C9CFD8" w:sz="4"/>
+              <w:bottom w:val="single" w:color="C9CFD8" w:sz="4"/>
+              <w:right w:val="single" w:color="C9CFD8" w:sz="4"/>
+            </w:tcBorders>
+            <w:shd w:fill="1C1E6B" w:color="auto" w:val="clear"/>
+            <w:tcMar>
+              <w:top w:type="dxa" w:w="50"/>
+              <w:left w:type="dxa" w:w="90"/>
+              <w:bottom w:type="dxa" w:w="50"/>
+              <w:right w:type="dxa" w:w="90"/>
+            </w:tcMar>
+            <w:vAlign w:val="center"/>
+          </w:tcPr>
+          <w:p>
+            <w:pPr>
+              <w:spacing w:after="0"/>
+            </w:pPr>
+            <w:r>
+              <w:rPr>
+                <w:rFonts w:ascii="Calibri" w:cs="Calibri" w:eastAsia="Calibri" w:hAnsi="Calibri"/>
+                <w:b/>
+                <w:bCs/>
+                <w:color w:val="FFFFFF"/>
+                <w:sz w:val="17"/>
+                <w:szCs w:val="17"/>
+              </w:rPr>
               <w:t xml:space="preserve">Sociétés</w:t>
             </w:r>
           </w:p>
@@ -1127,7 +1950,7 @@
       <w:tr>
         <w:tc>
           <w:tcPr>
-            <w:tcW w:type="dxa" w:w="1937"/>
+            <w:tcW w:type="dxa" w:w="1748"/>
             <w:tcBorders>
               <w:top w:val="single" w:color="C9CFD8" w:sz="4"/>
               <w:left w:val="single" w:color="C9CFD8" w:sz="4"/>
@@ -1158,7 +1981,7 @@
         </w:tc>
         <w:tc>
           <w:tcPr>
-            <w:tcW w:type="dxa" w:w="3309"/>
+            <w:tcW w:type="dxa" w:w="2906"/>
             <w:tcBorders>
               <w:top w:val="single" w:color="C9CFD8" w:sz="4"/>
               <w:left w:val="single" w:color="C9CFD8" w:sz="4"/>
@@ -1189,38 +2012,38 @@
         </w:tc>
         <w:tc>
           <w:tcPr>
-            <w:tcW w:type="dxa" w:w="2684"/>
-            <w:tcBorders>
-              <w:top w:val="single" w:color="C9CFD8" w:sz="4"/>
-              <w:left w:val="single" w:color="C9CFD8" w:sz="4"/>
-              <w:bottom w:val="single" w:color="C9CFD8" w:sz="4"/>
-              <w:right w:val="single" w:color="C9CFD8" w:sz="4"/>
-            </w:tcBorders>
-            <w:tcMar>
-              <w:top w:type="dxa" w:w="50"/>
-              <w:left w:type="dxa" w:w="90"/>
-              <w:bottom w:type="dxa" w:w="50"/>
-              <w:right w:type="dxa" w:w="90"/>
-            </w:tcMar>
-            <w:vAlign w:val="center"/>
-          </w:tcPr>
-          <w:p>
-            <w:pPr>
-              <w:spacing w:after="0"/>
-            </w:pPr>
-            <w:r>
-              <w:rPr>
-                <w:rFonts w:ascii="Calibri" w:cs="Calibri" w:eastAsia="Calibri" w:hAnsi="Calibri"/>
-                <w:sz w:val="17"/>
-                <w:szCs w:val="17"/>
-              </w:rPr>
-              <w:t xml:space="preserve">Finance, AxisPro (consultation)</w:t>
-            </w:r>
-          </w:p>
-        </w:tc>
-        <w:tc>
-          <w:tcPr>
-            <w:tcW w:type="dxa" w:w="1708"/>
+            <w:tcW w:type="dxa" w:w="3082"/>
+            <w:tcBorders>
+              <w:top w:val="single" w:color="C9CFD8" w:sz="4"/>
+              <w:left w:val="single" w:color="C9CFD8" w:sz="4"/>
+              <w:bottom w:val="single" w:color="C9CFD8" w:sz="4"/>
+              <w:right w:val="single" w:color="C9CFD8" w:sz="4"/>
+            </w:tcBorders>
+            <w:tcMar>
+              <w:top w:type="dxa" w:w="50"/>
+              <w:left w:type="dxa" w:w="90"/>
+              <w:bottom w:type="dxa" w:w="50"/>
+              <w:right w:type="dxa" w:w="90"/>
+            </w:tcMar>
+            <w:vAlign w:val="center"/>
+          </w:tcPr>
+          <w:p>
+            <w:pPr>
+              <w:spacing w:after="0"/>
+            </w:pPr>
+            <w:r>
+              <w:rPr>
+                <w:rFonts w:ascii="Calibri" w:cs="Calibri" w:eastAsia="Calibri" w:hAnsi="Calibri"/>
+                <w:sz w:val="17"/>
+                <w:szCs w:val="17"/>
+              </w:rPr>
+              <w:t xml:space="preserve">Finance, Transport, AxisPro (consultation), Analyse, RH</w:t>
+            </w:r>
+          </w:p>
+        </w:tc>
+        <w:tc>
+          <w:tcPr>
+            <w:tcW w:type="dxa" w:w="1903"/>
             <w:tcBorders>
               <w:top w:val="single" w:color="C9CFD8" w:sz="4"/>
               <w:left w:val="single" w:color="C9CFD8" w:sz="4"/>
@@ -1253,7 +2076,7 @@
       <w:tr>
         <w:tc>
           <w:tcPr>
-            <w:tcW w:type="dxa" w:w="1937"/>
+            <w:tcW w:type="dxa" w:w="1748"/>
             <w:tcBorders>
               <w:top w:val="single" w:color="C9CFD8" w:sz="4"/>
               <w:left w:val="single" w:color="C9CFD8" w:sz="4"/>
@@ -1285,7 +2108,7 @@
         </w:tc>
         <w:tc>
           <w:tcPr>
-            <w:tcW w:type="dxa" w:w="3309"/>
+            <w:tcW w:type="dxa" w:w="2906"/>
             <w:tcBorders>
               <w:top w:val="single" w:color="C9CFD8" w:sz="4"/>
               <w:left w:val="single" w:color="C9CFD8" w:sz="4"/>
@@ -1317,7 +2140,7 @@
         </w:tc>
         <w:tc>
           <w:tcPr>
-            <w:tcW w:type="dxa" w:w="2684"/>
+            <w:tcW w:type="dxa" w:w="3082"/>
             <w:tcBorders>
               <w:top w:val="single" w:color="C9CFD8" w:sz="4"/>
               <w:left w:val="single" w:color="C9CFD8" w:sz="4"/>
@@ -1343,13 +2166,13 @@
                 <w:sz w:val="17"/>
                 <w:szCs w:val="17"/>
               </w:rPr>
-              <w:t xml:space="preserve">Finance</w:t>
-            </w:r>
-          </w:p>
-        </w:tc>
-        <w:tc>
-          <w:tcPr>
-            <w:tcW w:type="dxa" w:w="1708"/>
+              <w:t xml:space="preserve">Finance, Transport, Analyse</w:t>
+            </w:r>
+          </w:p>
+        </w:tc>
+        <w:tc>
+          <w:tcPr>
+            <w:tcW w:type="dxa" w:w="1903"/>
             <w:tcBorders>
               <w:top w:val="single" w:color="C9CFD8" w:sz="4"/>
               <w:left w:val="single" w:color="C9CFD8" w:sz="4"/>
@@ -1383,7 +2206,7 @@
       <w:tr>
         <w:tc>
           <w:tcPr>
-            <w:tcW w:type="dxa" w:w="1937"/>
+            <w:tcW w:type="dxa" w:w="1748"/>
             <w:tcBorders>
               <w:top w:val="single" w:color="C9CFD8" w:sz="4"/>
               <w:left w:val="single" w:color="C9CFD8" w:sz="4"/>
@@ -1414,7 +2237,7 @@
         </w:tc>
         <w:tc>
           <w:tcPr>
-            <w:tcW w:type="dxa" w:w="3309"/>
+            <w:tcW w:type="dxa" w:w="2906"/>
             <w:tcBorders>
               <w:top w:val="single" w:color="C9CFD8" w:sz="4"/>
               <w:left w:val="single" w:color="C9CFD8" w:sz="4"/>
@@ -1445,38 +2268,38 @@
         </w:tc>
         <w:tc>
           <w:tcPr>
-            <w:tcW w:type="dxa" w:w="2684"/>
-            <w:tcBorders>
-              <w:top w:val="single" w:color="C9CFD8" w:sz="4"/>
-              <w:left w:val="single" w:color="C9CFD8" w:sz="4"/>
-              <w:bottom w:val="single" w:color="C9CFD8" w:sz="4"/>
-              <w:right w:val="single" w:color="C9CFD8" w:sz="4"/>
-            </w:tcBorders>
-            <w:tcMar>
-              <w:top w:type="dxa" w:w="50"/>
-              <w:left w:type="dxa" w:w="90"/>
-              <w:bottom w:type="dxa" w:w="50"/>
-              <w:right w:type="dxa" w:w="90"/>
-            </w:tcMar>
-            <w:vAlign w:val="center"/>
-          </w:tcPr>
-          <w:p>
-            <w:pPr>
-              <w:spacing w:after="0"/>
-            </w:pPr>
-            <w:r>
-              <w:rPr>
-                <w:rFonts w:ascii="Calibri" w:cs="Calibri" w:eastAsia="Calibri" w:hAnsi="Calibri"/>
-                <w:sz w:val="17"/>
-                <w:szCs w:val="17"/>
-              </w:rPr>
-              <w:t xml:space="preserve">Finance</w:t>
-            </w:r>
-          </w:p>
-        </w:tc>
-        <w:tc>
-          <w:tcPr>
-            <w:tcW w:type="dxa" w:w="1708"/>
+            <w:tcW w:type="dxa" w:w="3082"/>
+            <w:tcBorders>
+              <w:top w:val="single" w:color="C9CFD8" w:sz="4"/>
+              <w:left w:val="single" w:color="C9CFD8" w:sz="4"/>
+              <w:bottom w:val="single" w:color="C9CFD8" w:sz="4"/>
+              <w:right w:val="single" w:color="C9CFD8" w:sz="4"/>
+            </w:tcBorders>
+            <w:tcMar>
+              <w:top w:type="dxa" w:w="50"/>
+              <w:left w:type="dxa" w:w="90"/>
+              <w:bottom w:type="dxa" w:w="50"/>
+              <w:right w:type="dxa" w:w="90"/>
+            </w:tcMar>
+            <w:vAlign w:val="center"/>
+          </w:tcPr>
+          <w:p>
+            <w:pPr>
+              <w:spacing w:after="0"/>
+            </w:pPr>
+            <w:r>
+              <w:rPr>
+                <w:rFonts w:ascii="Calibri" w:cs="Calibri" w:eastAsia="Calibri" w:hAnsi="Calibri"/>
+                <w:sz w:val="17"/>
+                <w:szCs w:val="17"/>
+              </w:rPr>
+              <w:t xml:space="preserve">Finance, Transport, Analyse</w:t>
+            </w:r>
+          </w:p>
+        </w:tc>
+        <w:tc>
+          <w:tcPr>
+            <w:tcW w:type="dxa" w:w="1903"/>
             <w:tcBorders>
               <w:top w:val="single" w:color="C9CFD8" w:sz="4"/>
               <w:left w:val="single" w:color="C9CFD8" w:sz="4"/>
@@ -1509,7 +2332,7 @@
       <w:tr>
         <w:tc>
           <w:tcPr>
-            <w:tcW w:type="dxa" w:w="1937"/>
+            <w:tcW w:type="dxa" w:w="1748"/>
             <w:tcBorders>
               <w:top w:val="single" w:color="C9CFD8" w:sz="4"/>
               <w:left w:val="single" w:color="C9CFD8" w:sz="4"/>
@@ -1535,13 +2358,13 @@
                 <w:sz w:val="17"/>
                 <w:szCs w:val="17"/>
               </w:rPr>
-              <w:t xml:space="preserve">test.exploitation</w:t>
-            </w:r>
-          </w:p>
-        </w:tc>
-        <w:tc>
-          <w:tcPr>
-            <w:tcW w:type="dxa" w:w="3309"/>
+              <w:t xml:space="preserve">test.achats</w:t>
+            </w:r>
+          </w:p>
+        </w:tc>
+        <w:tc>
+          <w:tcPr>
+            <w:tcW w:type="dxa" w:w="2906"/>
             <w:tcBorders>
               <w:top w:val="single" w:color="C9CFD8" w:sz="4"/>
               <w:left w:val="single" w:color="C9CFD8" w:sz="4"/>
@@ -1567,13 +2390,13 @@
                 <w:sz w:val="17"/>
                 <w:szCs w:val="17"/>
               </w:rPr>
-              <w:t xml:space="preserve">Responsable exploitation transport</w:t>
-            </w:r>
-          </w:p>
-        </w:tc>
-        <w:tc>
-          <w:tcPr>
-            <w:tcW w:type="dxa" w:w="2684"/>
+              <w:t xml:space="preserve">Acheteur</w:t>
+            </w:r>
+          </w:p>
+        </w:tc>
+        <w:tc>
+          <w:tcPr>
+            <w:tcW w:type="dxa" w:w="3082"/>
             <w:tcBorders>
               <w:top w:val="single" w:color="C9CFD8" w:sz="4"/>
               <w:left w:val="single" w:color="C9CFD8" w:sz="4"/>
@@ -1599,13 +2422,13 @@
                 <w:sz w:val="17"/>
                 <w:szCs w:val="17"/>
               </w:rPr>
-              <w:t xml:space="preserve">Finance (transport), Rotations</w:t>
-            </w:r>
-          </w:p>
-        </w:tc>
-        <w:tc>
-          <w:tcPr>
-            <w:tcW w:type="dxa" w:w="1708"/>
+              <w:t xml:space="preserve">Finance (achats)</w:t>
+            </w:r>
+          </w:p>
+        </w:tc>
+        <w:tc>
+          <w:tcPr>
+            <w:tcW w:type="dxa" w:w="1903"/>
             <w:tcBorders>
               <w:top w:val="single" w:color="C9CFD8" w:sz="4"/>
               <w:left w:val="single" w:color="C9CFD8" w:sz="4"/>
@@ -1631,7 +2454,7 @@
                 <w:sz w:val="17"/>
                 <w:szCs w:val="17"/>
               </w:rPr>
-              <w:t xml:space="preserve">EGUITRA GROUP</w:t>
+              <w:t xml:space="preserve">Les deux</w:t>
             </w:r>
           </w:p>
         </w:tc>
@@ -1639,100 +2462,100 @@
       <w:tr>
         <w:tc>
           <w:tcPr>
-            <w:tcW w:type="dxa" w:w="1937"/>
-            <w:tcBorders>
-              <w:top w:val="single" w:color="C9CFD8" w:sz="4"/>
-              <w:left w:val="single" w:color="C9CFD8" w:sz="4"/>
-              <w:bottom w:val="single" w:color="C9CFD8" w:sz="4"/>
-              <w:right w:val="single" w:color="C9CFD8" w:sz="4"/>
-            </w:tcBorders>
-            <w:tcMar>
-              <w:top w:type="dxa" w:w="50"/>
-              <w:left w:type="dxa" w:w="90"/>
-              <w:bottom w:type="dxa" w:w="50"/>
-              <w:right w:type="dxa" w:w="90"/>
-            </w:tcMar>
-            <w:vAlign w:val="center"/>
-          </w:tcPr>
-          <w:p>
-            <w:pPr>
-              <w:spacing w:after="0"/>
-            </w:pPr>
-            <w:r>
-              <w:rPr>
-                <w:rFonts w:ascii="Calibri" w:cs="Calibri" w:eastAsia="Calibri" w:hAnsi="Calibri"/>
-                <w:sz w:val="17"/>
-                <w:szCs w:val="17"/>
-              </w:rPr>
-              <w:t xml:space="preserve">test.parc</w:t>
-            </w:r>
-          </w:p>
-        </w:tc>
-        <w:tc>
-          <w:tcPr>
-            <w:tcW w:type="dxa" w:w="3309"/>
-            <w:tcBorders>
-              <w:top w:val="single" w:color="C9CFD8" w:sz="4"/>
-              <w:left w:val="single" w:color="C9CFD8" w:sz="4"/>
-              <w:bottom w:val="single" w:color="C9CFD8" w:sz="4"/>
-              <w:right w:val="single" w:color="C9CFD8" w:sz="4"/>
-            </w:tcBorders>
-            <w:tcMar>
-              <w:top w:type="dxa" w:w="50"/>
-              <w:left w:type="dxa" w:w="90"/>
-              <w:bottom w:type="dxa" w:w="50"/>
-              <w:right w:type="dxa" w:w="90"/>
-            </w:tcMar>
-            <w:vAlign w:val="center"/>
-          </w:tcPr>
-          <w:p>
-            <w:pPr>
-              <w:spacing w:after="0"/>
-            </w:pPr>
-            <w:r>
-              <w:rPr>
-                <w:rFonts w:ascii="Calibri" w:cs="Calibri" w:eastAsia="Calibri" w:hAnsi="Calibri"/>
-                <w:sz w:val="17"/>
-                <w:szCs w:val="17"/>
-              </w:rPr>
-              <w:t xml:space="preserve">Agent de parc</w:t>
-            </w:r>
-          </w:p>
-        </w:tc>
-        <w:tc>
-          <w:tcPr>
-            <w:tcW w:type="dxa" w:w="2684"/>
-            <w:tcBorders>
-              <w:top w:val="single" w:color="C9CFD8" w:sz="4"/>
-              <w:left w:val="single" w:color="C9CFD8" w:sz="4"/>
-              <w:bottom w:val="single" w:color="C9CFD8" w:sz="4"/>
-              <w:right w:val="single" w:color="C9CFD8" w:sz="4"/>
-            </w:tcBorders>
-            <w:tcMar>
-              <w:top w:type="dxa" w:w="50"/>
-              <w:left w:type="dxa" w:w="90"/>
-              <w:bottom w:type="dxa" w:w="50"/>
-              <w:right w:type="dxa" w:w="90"/>
-            </w:tcMar>
-            <w:vAlign w:val="center"/>
-          </w:tcPr>
-          <w:p>
-            <w:pPr>
-              <w:spacing w:after="0"/>
-            </w:pPr>
-            <w:r>
-              <w:rPr>
-                <w:rFonts w:ascii="Calibri" w:cs="Calibri" w:eastAsia="Calibri" w:hAnsi="Calibri"/>
-                <w:sz w:val="17"/>
-                <w:szCs w:val="17"/>
-              </w:rPr>
-              <w:t xml:space="preserve">Rotations, Finance (transport)</w:t>
-            </w:r>
-          </w:p>
-        </w:tc>
-        <w:tc>
-          <w:tcPr>
-            <w:tcW w:type="dxa" w:w="1708"/>
+            <w:tcW w:type="dxa" w:w="1748"/>
+            <w:tcBorders>
+              <w:top w:val="single" w:color="C9CFD8" w:sz="4"/>
+              <w:left w:val="single" w:color="C9CFD8" w:sz="4"/>
+              <w:bottom w:val="single" w:color="C9CFD8" w:sz="4"/>
+              <w:right w:val="single" w:color="C9CFD8" w:sz="4"/>
+            </w:tcBorders>
+            <w:tcMar>
+              <w:top w:type="dxa" w:w="50"/>
+              <w:left w:type="dxa" w:w="90"/>
+              <w:bottom w:type="dxa" w:w="50"/>
+              <w:right w:type="dxa" w:w="90"/>
+            </w:tcMar>
+            <w:vAlign w:val="center"/>
+          </w:tcPr>
+          <w:p>
+            <w:pPr>
+              <w:spacing w:after="0"/>
+            </w:pPr>
+            <w:r>
+              <w:rPr>
+                <w:rFonts w:ascii="Calibri" w:cs="Calibri" w:eastAsia="Calibri" w:hAnsi="Calibri"/>
+                <w:sz w:val="17"/>
+                <w:szCs w:val="17"/>
+              </w:rPr>
+              <w:t xml:space="preserve">test.exploitation</w:t>
+            </w:r>
+          </w:p>
+        </w:tc>
+        <w:tc>
+          <w:tcPr>
+            <w:tcW w:type="dxa" w:w="2906"/>
+            <w:tcBorders>
+              <w:top w:val="single" w:color="C9CFD8" w:sz="4"/>
+              <w:left w:val="single" w:color="C9CFD8" w:sz="4"/>
+              <w:bottom w:val="single" w:color="C9CFD8" w:sz="4"/>
+              <w:right w:val="single" w:color="C9CFD8" w:sz="4"/>
+            </w:tcBorders>
+            <w:tcMar>
+              <w:top w:type="dxa" w:w="50"/>
+              <w:left w:type="dxa" w:w="90"/>
+              <w:bottom w:type="dxa" w:w="50"/>
+              <w:right w:type="dxa" w:w="90"/>
+            </w:tcMar>
+            <w:vAlign w:val="center"/>
+          </w:tcPr>
+          <w:p>
+            <w:pPr>
+              <w:spacing w:after="0"/>
+            </w:pPr>
+            <w:r>
+              <w:rPr>
+                <w:rFonts w:ascii="Calibri" w:cs="Calibri" w:eastAsia="Calibri" w:hAnsi="Calibri"/>
+                <w:sz w:val="17"/>
+                <w:szCs w:val="17"/>
+              </w:rPr>
+              <w:t xml:space="preserve">Responsable exploitation transport</w:t>
+            </w:r>
+          </w:p>
+        </w:tc>
+        <w:tc>
+          <w:tcPr>
+            <w:tcW w:type="dxa" w:w="3082"/>
+            <w:tcBorders>
+              <w:top w:val="single" w:color="C9CFD8" w:sz="4"/>
+              <w:left w:val="single" w:color="C9CFD8" w:sz="4"/>
+              <w:bottom w:val="single" w:color="C9CFD8" w:sz="4"/>
+              <w:right w:val="single" w:color="C9CFD8" w:sz="4"/>
+            </w:tcBorders>
+            <w:tcMar>
+              <w:top w:type="dxa" w:w="50"/>
+              <w:left w:type="dxa" w:w="90"/>
+              <w:bottom w:type="dxa" w:w="50"/>
+              <w:right w:type="dxa" w:w="90"/>
+            </w:tcMar>
+            <w:vAlign w:val="center"/>
+          </w:tcPr>
+          <w:p>
+            <w:pPr>
+              <w:spacing w:after="0"/>
+            </w:pPr>
+            <w:r>
+              <w:rPr>
+                <w:rFonts w:ascii="Calibri" w:cs="Calibri" w:eastAsia="Calibri" w:hAnsi="Calibri"/>
+                <w:sz w:val="17"/>
+                <w:szCs w:val="17"/>
+              </w:rPr>
+              <w:t xml:space="preserve">Finance, Transport, Rotations</w:t>
+            </w:r>
+          </w:p>
+        </w:tc>
+        <w:tc>
+          <w:tcPr>
+            <w:tcW w:type="dxa" w:w="1903"/>
             <w:tcBorders>
               <w:top w:val="single" w:color="C9CFD8" w:sz="4"/>
               <w:left w:val="single" w:color="C9CFD8" w:sz="4"/>
@@ -1765,7 +2588,7 @@
       <w:tr>
         <w:tc>
           <w:tcPr>
-            <w:tcW w:type="dxa" w:w="1937"/>
+            <w:tcW w:type="dxa" w:w="1748"/>
             <w:tcBorders>
               <w:top w:val="single" w:color="C9CFD8" w:sz="4"/>
               <w:left w:val="single" w:color="C9CFD8" w:sz="4"/>
@@ -1791,13 +2614,13 @@
                 <w:sz w:val="17"/>
                 <w:szCs w:val="17"/>
               </w:rPr>
-              <w:t xml:space="preserve">test.chantiers</w:t>
-            </w:r>
-          </w:p>
-        </w:tc>
-        <w:tc>
-          <w:tcPr>
-            <w:tcW w:type="dxa" w:w="3309"/>
+              <w:t xml:space="preserve">test.parc</w:t>
+            </w:r>
+          </w:p>
+        </w:tc>
+        <w:tc>
+          <w:tcPr>
+            <w:tcW w:type="dxa" w:w="2906"/>
             <w:tcBorders>
               <w:top w:val="single" w:color="C9CFD8" w:sz="4"/>
               <w:left w:val="single" w:color="C9CFD8" w:sz="4"/>
@@ -1823,13 +2646,13 @@
                 <w:sz w:val="17"/>
                 <w:szCs w:val="17"/>
               </w:rPr>
-              <w:t xml:space="preserve">Conducteur de travaux</w:t>
-            </w:r>
-          </w:p>
-        </w:tc>
-        <w:tc>
-          <w:tcPr>
-            <w:tcW w:type="dxa" w:w="2684"/>
+              <w:t xml:space="preserve">Agent de parc</w:t>
+            </w:r>
+          </w:p>
+        </w:tc>
+        <w:tc>
+          <w:tcPr>
+            <w:tcW w:type="dxa" w:w="3082"/>
             <w:tcBorders>
               <w:top w:val="single" w:color="C9CFD8" w:sz="4"/>
               <w:left w:val="single" w:color="C9CFD8" w:sz="4"/>
@@ -1855,13 +2678,13 @@
                 <w:sz w:val="17"/>
                 <w:szCs w:val="17"/>
               </w:rPr>
-              <w:t xml:space="preserve">Finance (chantiers)</w:t>
-            </w:r>
-          </w:p>
-        </w:tc>
-        <w:tc>
-          <w:tcPr>
-            <w:tcW w:type="dxa" w:w="1708"/>
+              <w:t xml:space="preserve">Rotations, Transport, Finance</w:t>
+            </w:r>
+          </w:p>
+        </w:tc>
+        <w:tc>
+          <w:tcPr>
+            <w:tcW w:type="dxa" w:w="1903"/>
             <w:tcBorders>
               <w:top w:val="single" w:color="C9CFD8" w:sz="4"/>
               <w:left w:val="single" w:color="C9CFD8" w:sz="4"/>
@@ -1895,100 +2718,100 @@
       <w:tr>
         <w:tc>
           <w:tcPr>
-            <w:tcW w:type="dxa" w:w="1937"/>
-            <w:tcBorders>
-              <w:top w:val="single" w:color="C9CFD8" w:sz="4"/>
-              <w:left w:val="single" w:color="C9CFD8" w:sz="4"/>
-              <w:bottom w:val="single" w:color="C9CFD8" w:sz="4"/>
-              <w:right w:val="single" w:color="C9CFD8" w:sz="4"/>
-            </w:tcBorders>
-            <w:tcMar>
-              <w:top w:type="dxa" w:w="50"/>
-              <w:left w:type="dxa" w:w="90"/>
-              <w:bottom w:type="dxa" w:w="50"/>
-              <w:right w:type="dxa" w:w="90"/>
-            </w:tcMar>
-            <w:vAlign w:val="center"/>
-          </w:tcPr>
-          <w:p>
-            <w:pPr>
-              <w:spacing w:after="0"/>
-            </w:pPr>
-            <w:r>
-              <w:rPr>
-                <w:rFonts w:ascii="Calibri" w:cs="Calibri" w:eastAsia="Calibri" w:hAnsi="Calibri"/>
-                <w:sz w:val="17"/>
-                <w:szCs w:val="17"/>
-              </w:rPr>
-              <w:t xml:space="preserve">test.immobilier</w:t>
-            </w:r>
-          </w:p>
-        </w:tc>
-        <w:tc>
-          <w:tcPr>
-            <w:tcW w:type="dxa" w:w="3309"/>
-            <w:tcBorders>
-              <w:top w:val="single" w:color="C9CFD8" w:sz="4"/>
-              <w:left w:val="single" w:color="C9CFD8" w:sz="4"/>
-              <w:bottom w:val="single" w:color="C9CFD8" w:sz="4"/>
-              <w:right w:val="single" w:color="C9CFD8" w:sz="4"/>
-            </w:tcBorders>
-            <w:tcMar>
-              <w:top w:type="dxa" w:w="50"/>
-              <w:left w:type="dxa" w:w="90"/>
-              <w:bottom w:type="dxa" w:w="50"/>
-              <w:right w:type="dxa" w:w="90"/>
-            </w:tcMar>
-            <w:vAlign w:val="center"/>
-          </w:tcPr>
-          <w:p>
-            <w:pPr>
-              <w:spacing w:after="0"/>
-            </w:pPr>
-            <w:r>
-              <w:rPr>
-                <w:rFonts w:ascii="Calibri" w:cs="Calibri" w:eastAsia="Calibri" w:hAnsi="Calibri"/>
-                <w:sz w:val="17"/>
-                <w:szCs w:val="17"/>
-              </w:rPr>
-              <w:t xml:space="preserve">Gestionnaire immobilier</w:t>
-            </w:r>
-          </w:p>
-        </w:tc>
-        <w:tc>
-          <w:tcPr>
-            <w:tcW w:type="dxa" w:w="2684"/>
-            <w:tcBorders>
-              <w:top w:val="single" w:color="C9CFD8" w:sz="4"/>
-              <w:left w:val="single" w:color="C9CFD8" w:sz="4"/>
-              <w:bottom w:val="single" w:color="C9CFD8" w:sz="4"/>
-              <w:right w:val="single" w:color="C9CFD8" w:sz="4"/>
-            </w:tcBorders>
-            <w:tcMar>
-              <w:top w:type="dxa" w:w="50"/>
-              <w:left w:type="dxa" w:w="90"/>
-              <w:bottom w:type="dxa" w:w="50"/>
-              <w:right w:type="dxa" w:w="90"/>
-            </w:tcMar>
-            <w:vAlign w:val="center"/>
-          </w:tcPr>
-          <w:p>
-            <w:pPr>
-              <w:spacing w:after="0"/>
-            </w:pPr>
-            <w:r>
-              <w:rPr>
-                <w:rFonts w:ascii="Calibri" w:cs="Calibri" w:eastAsia="Calibri" w:hAnsi="Calibri"/>
-                <w:sz w:val="17"/>
-                <w:szCs w:val="17"/>
-              </w:rPr>
-              <w:t xml:space="preserve">Finance (immobilier)</w:t>
-            </w:r>
-          </w:p>
-        </w:tc>
-        <w:tc>
-          <w:tcPr>
-            <w:tcW w:type="dxa" w:w="1708"/>
+            <w:tcW w:type="dxa" w:w="1748"/>
+            <w:tcBorders>
+              <w:top w:val="single" w:color="C9CFD8" w:sz="4"/>
+              <w:left w:val="single" w:color="C9CFD8" w:sz="4"/>
+              <w:bottom w:val="single" w:color="C9CFD8" w:sz="4"/>
+              <w:right w:val="single" w:color="C9CFD8" w:sz="4"/>
+            </w:tcBorders>
+            <w:tcMar>
+              <w:top w:type="dxa" w:w="50"/>
+              <w:left w:type="dxa" w:w="90"/>
+              <w:bottom w:type="dxa" w:w="50"/>
+              <w:right w:type="dxa" w:w="90"/>
+            </w:tcMar>
+            <w:vAlign w:val="center"/>
+          </w:tcPr>
+          <w:p>
+            <w:pPr>
+              <w:spacing w:after="0"/>
+            </w:pPr>
+            <w:r>
+              <w:rPr>
+                <w:rFonts w:ascii="Calibri" w:cs="Calibri" w:eastAsia="Calibri" w:hAnsi="Calibri"/>
+                <w:sz w:val="17"/>
+                <w:szCs w:val="17"/>
+              </w:rPr>
+              <w:t xml:space="preserve">test.chantiers</w:t>
+            </w:r>
+          </w:p>
+        </w:tc>
+        <w:tc>
+          <w:tcPr>
+            <w:tcW w:type="dxa" w:w="2906"/>
+            <w:tcBorders>
+              <w:top w:val="single" w:color="C9CFD8" w:sz="4"/>
+              <w:left w:val="single" w:color="C9CFD8" w:sz="4"/>
+              <w:bottom w:val="single" w:color="C9CFD8" w:sz="4"/>
+              <w:right w:val="single" w:color="C9CFD8" w:sz="4"/>
+            </w:tcBorders>
+            <w:tcMar>
+              <w:top w:type="dxa" w:w="50"/>
+              <w:left w:type="dxa" w:w="90"/>
+              <w:bottom w:type="dxa" w:w="50"/>
+              <w:right w:type="dxa" w:w="90"/>
+            </w:tcMar>
+            <w:vAlign w:val="center"/>
+          </w:tcPr>
+          <w:p>
+            <w:pPr>
+              <w:spacing w:after="0"/>
+            </w:pPr>
+            <w:r>
+              <w:rPr>
+                <w:rFonts w:ascii="Calibri" w:cs="Calibri" w:eastAsia="Calibri" w:hAnsi="Calibri"/>
+                <w:sz w:val="17"/>
+                <w:szCs w:val="17"/>
+              </w:rPr>
+              <w:t xml:space="preserve">Conducteur de travaux</w:t>
+            </w:r>
+          </w:p>
+        </w:tc>
+        <w:tc>
+          <w:tcPr>
+            <w:tcW w:type="dxa" w:w="3082"/>
+            <w:tcBorders>
+              <w:top w:val="single" w:color="C9CFD8" w:sz="4"/>
+              <w:left w:val="single" w:color="C9CFD8" w:sz="4"/>
+              <w:bottom w:val="single" w:color="C9CFD8" w:sz="4"/>
+              <w:right w:val="single" w:color="C9CFD8" w:sz="4"/>
+            </w:tcBorders>
+            <w:tcMar>
+              <w:top w:type="dxa" w:w="50"/>
+              <w:left w:type="dxa" w:w="90"/>
+              <w:bottom w:type="dxa" w:w="50"/>
+              <w:right w:type="dxa" w:w="90"/>
+            </w:tcMar>
+            <w:vAlign w:val="center"/>
+          </w:tcPr>
+          <w:p>
+            <w:pPr>
+              <w:spacing w:after="0"/>
+            </w:pPr>
+            <w:r>
+              <w:rPr>
+                <w:rFonts w:ascii="Calibri" w:cs="Calibri" w:eastAsia="Calibri" w:hAnsi="Calibri"/>
+                <w:sz w:val="17"/>
+                <w:szCs w:val="17"/>
+              </w:rPr>
+              <w:t xml:space="preserve">Finance (BTP)</w:t>
+            </w:r>
+          </w:p>
+        </w:tc>
+        <w:tc>
+          <w:tcPr>
+            <w:tcW w:type="dxa" w:w="1903"/>
             <w:tcBorders>
               <w:top w:val="single" w:color="C9CFD8" w:sz="4"/>
               <w:left w:val="single" w:color="C9CFD8" w:sz="4"/>
@@ -2021,7 +2844,7 @@
       <w:tr>
         <w:tc>
           <w:tcPr>
-            <w:tcW w:type="dxa" w:w="1937"/>
+            <w:tcW w:type="dxa" w:w="1748"/>
             <w:tcBorders>
               <w:top w:val="single" w:color="C9CFD8" w:sz="4"/>
               <w:left w:val="single" w:color="C9CFD8" w:sz="4"/>
@@ -2047,13 +2870,13 @@
                 <w:sz w:val="17"/>
                 <w:szCs w:val="17"/>
               </w:rPr>
-              <w:t xml:space="preserve">test.consultant</w:t>
-            </w:r>
-          </w:p>
-        </w:tc>
-        <w:tc>
-          <w:tcPr>
-            <w:tcW w:type="dxa" w:w="3309"/>
+              <w:t xml:space="preserve">test.immobilier</w:t>
+            </w:r>
+          </w:p>
+        </w:tc>
+        <w:tc>
+          <w:tcPr>
+            <w:tcW w:type="dxa" w:w="2906"/>
             <w:tcBorders>
               <w:top w:val="single" w:color="C9CFD8" w:sz="4"/>
               <w:left w:val="single" w:color="C9CFD8" w:sz="4"/>
@@ -2079,13 +2902,13 @@
                 <w:sz w:val="17"/>
                 <w:szCs w:val="17"/>
               </w:rPr>
-              <w:t xml:space="preserve">Consultant du cabinet</w:t>
-            </w:r>
-          </w:p>
-        </w:tc>
-        <w:tc>
-          <w:tcPr>
-            <w:tcW w:type="dxa" w:w="2684"/>
+              <w:t xml:space="preserve">Gestionnaire immobilier</w:t>
+            </w:r>
+          </w:p>
+        </w:tc>
+        <w:tc>
+          <w:tcPr>
+            <w:tcW w:type="dxa" w:w="3082"/>
             <w:tcBorders>
               <w:top w:val="single" w:color="C9CFD8" w:sz="4"/>
               <w:left w:val="single" w:color="C9CFD8" w:sz="4"/>
@@ -2111,13 +2934,13 @@
                 <w:sz w:val="17"/>
                 <w:szCs w:val="17"/>
               </w:rPr>
-              <w:t xml:space="preserve">AxisPro</w:t>
-            </w:r>
-          </w:p>
-        </w:tc>
-        <w:tc>
-          <w:tcPr>
-            <w:tcW w:type="dxa" w:w="1708"/>
+              <w:t xml:space="preserve">Finance (immobilier)</w:t>
+            </w:r>
+          </w:p>
+        </w:tc>
+        <w:tc>
+          <w:tcPr>
+            <w:tcW w:type="dxa" w:w="1903"/>
             <w:tcBorders>
               <w:top w:val="single" w:color="C9CFD8" w:sz="4"/>
               <w:left w:val="single" w:color="C9CFD8" w:sz="4"/>
@@ -2143,7 +2966,7 @@
                 <w:sz w:val="17"/>
                 <w:szCs w:val="17"/>
               </w:rPr>
-              <w:t xml:space="preserve">MB AxisPro</w:t>
+              <w:t xml:space="preserve">EGUITRA GROUP</w:t>
             </w:r>
           </w:p>
         </w:tc>
@@ -2151,125 +2974,125 @@
       <w:tr>
         <w:tc>
           <w:tcPr>
-            <w:tcW w:type="dxa" w:w="1937"/>
-            <w:tcBorders>
-              <w:top w:val="single" w:color="C9CFD8" w:sz="4"/>
-              <w:left w:val="single" w:color="C9CFD8" w:sz="4"/>
-              <w:bottom w:val="single" w:color="C9CFD8" w:sz="4"/>
-              <w:right w:val="single" w:color="C9CFD8" w:sz="4"/>
-            </w:tcBorders>
-            <w:tcMar>
-              <w:top w:type="dxa" w:w="50"/>
-              <w:left w:type="dxa" w:w="90"/>
-              <w:bottom w:type="dxa" w:w="50"/>
-              <w:right w:type="dxa" w:w="90"/>
-            </w:tcMar>
-            <w:vAlign w:val="center"/>
-          </w:tcPr>
-          <w:p>
-            <w:pPr>
-              <w:spacing w:after="0"/>
-            </w:pPr>
-            <w:r>
-              <w:rPr>
-                <w:rFonts w:ascii="Calibri" w:cs="Calibri" w:eastAsia="Calibri" w:hAnsi="Calibri"/>
-                <w:sz w:val="17"/>
-                <w:szCs w:val="17"/>
-              </w:rPr>
-              <w:t xml:space="preserve">test.admin</w:t>
-            </w:r>
-          </w:p>
-        </w:tc>
-        <w:tc>
-          <w:tcPr>
-            <w:tcW w:type="dxa" w:w="3309"/>
-            <w:tcBorders>
-              <w:top w:val="single" w:color="C9CFD8" w:sz="4"/>
-              <w:left w:val="single" w:color="C9CFD8" w:sz="4"/>
-              <w:bottom w:val="single" w:color="C9CFD8" w:sz="4"/>
-              <w:right w:val="single" w:color="C9CFD8" w:sz="4"/>
-            </w:tcBorders>
-            <w:tcMar>
-              <w:top w:type="dxa" w:w="50"/>
-              <w:left w:type="dxa" w:w="90"/>
-              <w:bottom w:type="dxa" w:w="50"/>
-              <w:right w:type="dxa" w:w="90"/>
-            </w:tcMar>
-            <w:vAlign w:val="center"/>
-          </w:tcPr>
-          <w:p>
-            <w:pPr>
-              <w:spacing w:after="0"/>
-            </w:pPr>
-            <w:r>
-              <w:rPr>
-                <w:rFonts w:ascii="Calibri" w:cs="Calibri" w:eastAsia="Calibri" w:hAnsi="Calibri"/>
-                <w:sz w:val="17"/>
-                <w:szCs w:val="17"/>
-              </w:rPr>
-              <w:t xml:space="preserve">Administrateur</w:t>
-            </w:r>
-          </w:p>
-        </w:tc>
-        <w:tc>
-          <w:tcPr>
-            <w:tcW w:type="dxa" w:w="2684"/>
-            <w:tcBorders>
-              <w:top w:val="single" w:color="C9CFD8" w:sz="4"/>
-              <w:left w:val="single" w:color="C9CFD8" w:sz="4"/>
-              <w:bottom w:val="single" w:color="C9CFD8" w:sz="4"/>
-              <w:right w:val="single" w:color="C9CFD8" w:sz="4"/>
-            </w:tcBorders>
-            <w:tcMar>
-              <w:top w:type="dxa" w:w="50"/>
-              <w:left w:type="dxa" w:w="90"/>
-              <w:bottom w:type="dxa" w:w="50"/>
-              <w:right w:type="dxa" w:w="90"/>
-            </w:tcMar>
-            <w:vAlign w:val="center"/>
-          </w:tcPr>
-          <w:p>
-            <w:pPr>
-              <w:spacing w:after="0"/>
-            </w:pPr>
-            <w:r>
-              <w:rPr>
-                <w:rFonts w:ascii="Calibri" w:cs="Calibri" w:eastAsia="Calibri" w:hAnsi="Calibri"/>
-                <w:sz w:val="17"/>
-                <w:szCs w:val="17"/>
-              </w:rPr>
-              <w:t xml:space="preserve">Toutes</w:t>
-            </w:r>
-          </w:p>
-        </w:tc>
-        <w:tc>
-          <w:tcPr>
-            <w:tcW w:type="dxa" w:w="1708"/>
-            <w:tcBorders>
-              <w:top w:val="single" w:color="C9CFD8" w:sz="4"/>
-              <w:left w:val="single" w:color="C9CFD8" w:sz="4"/>
-              <w:bottom w:val="single" w:color="C9CFD8" w:sz="4"/>
-              <w:right w:val="single" w:color="C9CFD8" w:sz="4"/>
-            </w:tcBorders>
-            <w:tcMar>
-              <w:top w:type="dxa" w:w="50"/>
-              <w:left w:type="dxa" w:w="90"/>
-              <w:bottom w:type="dxa" w:w="50"/>
-              <w:right w:type="dxa" w:w="90"/>
-            </w:tcMar>
-            <w:vAlign w:val="center"/>
-          </w:tcPr>
-          <w:p>
-            <w:pPr>
-              <w:spacing w:after="0"/>
-            </w:pPr>
-            <w:r>
-              <w:rPr>
-                <w:rFonts w:ascii="Calibri" w:cs="Calibri" w:eastAsia="Calibri" w:hAnsi="Calibri"/>
-                <w:sz w:val="17"/>
-                <w:szCs w:val="17"/>
-              </w:rPr>
-              <w:t xml:space="preserve">Les deux</w:t>
+            <w:tcW w:type="dxa" w:w="1748"/>
+            <w:tcBorders>
+              <w:top w:val="single" w:color="C9CFD8" w:sz="4"/>
+              <w:left w:val="single" w:color="C9CFD8" w:sz="4"/>
+              <w:bottom w:val="single" w:color="C9CFD8" w:sz="4"/>
+              <w:right w:val="single" w:color="C9CFD8" w:sz="4"/>
+            </w:tcBorders>
+            <w:tcMar>
+              <w:top w:type="dxa" w:w="50"/>
+              <w:left w:type="dxa" w:w="90"/>
+              <w:bottom w:type="dxa" w:w="50"/>
+              <w:right w:type="dxa" w:w="90"/>
+            </w:tcMar>
+            <w:vAlign w:val="center"/>
+          </w:tcPr>
+          <w:p>
+            <w:pPr>
+              <w:spacing w:after="0"/>
+            </w:pPr>
+            <w:r>
+              <w:rPr>
+                <w:rFonts w:ascii="Calibri" w:cs="Calibri" w:eastAsia="Calibri" w:hAnsi="Calibri"/>
+                <w:sz w:val="17"/>
+                <w:szCs w:val="17"/>
+              </w:rPr>
+              <w:t xml:space="preserve">test.consultant</w:t>
+            </w:r>
+          </w:p>
+        </w:tc>
+        <w:tc>
+          <w:tcPr>
+            <w:tcW w:type="dxa" w:w="2906"/>
+            <w:tcBorders>
+              <w:top w:val="single" w:color="C9CFD8" w:sz="4"/>
+              <w:left w:val="single" w:color="C9CFD8" w:sz="4"/>
+              <w:bottom w:val="single" w:color="C9CFD8" w:sz="4"/>
+              <w:right w:val="single" w:color="C9CFD8" w:sz="4"/>
+            </w:tcBorders>
+            <w:tcMar>
+              <w:top w:type="dxa" w:w="50"/>
+              <w:left w:type="dxa" w:w="90"/>
+              <w:bottom w:type="dxa" w:w="50"/>
+              <w:right w:type="dxa" w:w="90"/>
+            </w:tcMar>
+            <w:vAlign w:val="center"/>
+          </w:tcPr>
+          <w:p>
+            <w:pPr>
+              <w:spacing w:after="0"/>
+            </w:pPr>
+            <w:r>
+              <w:rPr>
+                <w:rFonts w:ascii="Calibri" w:cs="Calibri" w:eastAsia="Calibri" w:hAnsi="Calibri"/>
+                <w:sz w:val="17"/>
+                <w:szCs w:val="17"/>
+              </w:rPr>
+              <w:t xml:space="preserve">Consultant du cabinet</w:t>
+            </w:r>
+          </w:p>
+        </w:tc>
+        <w:tc>
+          <w:tcPr>
+            <w:tcW w:type="dxa" w:w="3082"/>
+            <w:tcBorders>
+              <w:top w:val="single" w:color="C9CFD8" w:sz="4"/>
+              <w:left w:val="single" w:color="C9CFD8" w:sz="4"/>
+              <w:bottom w:val="single" w:color="C9CFD8" w:sz="4"/>
+              <w:right w:val="single" w:color="C9CFD8" w:sz="4"/>
+            </w:tcBorders>
+            <w:tcMar>
+              <w:top w:type="dxa" w:w="50"/>
+              <w:left w:type="dxa" w:w="90"/>
+              <w:bottom w:type="dxa" w:w="50"/>
+              <w:right w:type="dxa" w:w="90"/>
+            </w:tcMar>
+            <w:vAlign w:val="center"/>
+          </w:tcPr>
+          <w:p>
+            <w:pPr>
+              <w:spacing w:after="0"/>
+            </w:pPr>
+            <w:r>
+              <w:rPr>
+                <w:rFonts w:ascii="Calibri" w:cs="Calibri" w:eastAsia="Calibri" w:hAnsi="Calibri"/>
+                <w:sz w:val="17"/>
+                <w:szCs w:val="17"/>
+              </w:rPr>
+              <w:t xml:space="preserve">AxisPro, Analyse</w:t>
+            </w:r>
+          </w:p>
+        </w:tc>
+        <w:tc>
+          <w:tcPr>
+            <w:tcW w:type="dxa" w:w="1903"/>
+            <w:tcBorders>
+              <w:top w:val="single" w:color="C9CFD8" w:sz="4"/>
+              <w:left w:val="single" w:color="C9CFD8" w:sz="4"/>
+              <w:bottom w:val="single" w:color="C9CFD8" w:sz="4"/>
+              <w:right w:val="single" w:color="C9CFD8" w:sz="4"/>
+            </w:tcBorders>
+            <w:tcMar>
+              <w:top w:type="dxa" w:w="50"/>
+              <w:left w:type="dxa" w:w="90"/>
+              <w:bottom w:type="dxa" w:w="50"/>
+              <w:right w:type="dxa" w:w="90"/>
+            </w:tcMar>
+            <w:vAlign w:val="center"/>
+          </w:tcPr>
+          <w:p>
+            <w:pPr>
+              <w:spacing w:after="0"/>
+            </w:pPr>
+            <w:r>
+              <w:rPr>
+                <w:rFonts w:ascii="Calibri" w:cs="Calibri" w:eastAsia="Calibri" w:hAnsi="Calibri"/>
+                <w:sz w:val="17"/>
+                <w:szCs w:val="17"/>
+              </w:rPr>
+              <w:t xml:space="preserve">MB AxisPro Consulting</w:t>
             </w:r>
           </w:p>
         </w:tc>
@@ -2277,7 +3100,7 @@
       <w:tr>
         <w:tc>
           <w:tcPr>
-            <w:tcW w:type="dxa" w:w="1937"/>
+            <w:tcW w:type="dxa" w:w="1748"/>
             <w:tcBorders>
               <w:top w:val="single" w:color="C9CFD8" w:sz="4"/>
               <w:left w:val="single" w:color="C9CFD8" w:sz="4"/>
@@ -2303,13 +3126,525 @@
                 <w:sz w:val="17"/>
                 <w:szCs w:val="17"/>
               </w:rPr>
+              <w:t xml:space="preserve">test.associe</w:t>
+            </w:r>
+          </w:p>
+        </w:tc>
+        <w:tc>
+          <w:tcPr>
+            <w:tcW w:type="dxa" w:w="2906"/>
+            <w:tcBorders>
+              <w:top w:val="single" w:color="C9CFD8" w:sz="4"/>
+              <w:left w:val="single" w:color="C9CFD8" w:sz="4"/>
+              <w:bottom w:val="single" w:color="C9CFD8" w:sz="4"/>
+              <w:right w:val="single" w:color="C9CFD8" w:sz="4"/>
+            </w:tcBorders>
+            <w:shd w:fill="F2F4F7" w:color="auto" w:val="clear"/>
+            <w:tcMar>
+              <w:top w:type="dxa" w:w="50"/>
+              <w:left w:type="dxa" w:w="90"/>
+              <w:bottom w:type="dxa" w:w="50"/>
+              <w:right w:type="dxa" w:w="90"/>
+            </w:tcMar>
+            <w:vAlign w:val="center"/>
+          </w:tcPr>
+          <w:p>
+            <w:pPr>
+              <w:spacing w:after="0"/>
+            </w:pPr>
+            <w:r>
+              <w:rPr>
+                <w:rFonts w:ascii="Calibri" w:cs="Calibri" w:eastAsia="Calibri" w:hAnsi="Calibri"/>
+                <w:sz w:val="17"/>
+                <w:szCs w:val="17"/>
+              </w:rPr>
+              <w:t xml:space="preserve">Associé du cabinet (second regard)</w:t>
+            </w:r>
+          </w:p>
+        </w:tc>
+        <w:tc>
+          <w:tcPr>
+            <w:tcW w:type="dxa" w:w="3082"/>
+            <w:tcBorders>
+              <w:top w:val="single" w:color="C9CFD8" w:sz="4"/>
+              <w:left w:val="single" w:color="C9CFD8" w:sz="4"/>
+              <w:bottom w:val="single" w:color="C9CFD8" w:sz="4"/>
+              <w:right w:val="single" w:color="C9CFD8" w:sz="4"/>
+            </w:tcBorders>
+            <w:shd w:fill="F2F4F7" w:color="auto" w:val="clear"/>
+            <w:tcMar>
+              <w:top w:type="dxa" w:w="50"/>
+              <w:left w:type="dxa" w:w="90"/>
+              <w:bottom w:type="dxa" w:w="50"/>
+              <w:right w:type="dxa" w:w="90"/>
+            </w:tcMar>
+            <w:vAlign w:val="center"/>
+          </w:tcPr>
+          <w:p>
+            <w:pPr>
+              <w:spacing w:after="0"/>
+            </w:pPr>
+            <w:r>
+              <w:rPr>
+                <w:rFonts w:ascii="Calibri" w:cs="Calibri" w:eastAsia="Calibri" w:hAnsi="Calibri"/>
+                <w:sz w:val="17"/>
+                <w:szCs w:val="17"/>
+              </w:rPr>
+              <w:t xml:space="preserve">AxisPro, Analyse</w:t>
+            </w:r>
+          </w:p>
+        </w:tc>
+        <w:tc>
+          <w:tcPr>
+            <w:tcW w:type="dxa" w:w="1903"/>
+            <w:tcBorders>
+              <w:top w:val="single" w:color="C9CFD8" w:sz="4"/>
+              <w:left w:val="single" w:color="C9CFD8" w:sz="4"/>
+              <w:bottom w:val="single" w:color="C9CFD8" w:sz="4"/>
+              <w:right w:val="single" w:color="C9CFD8" w:sz="4"/>
+            </w:tcBorders>
+            <w:shd w:fill="F2F4F7" w:color="auto" w:val="clear"/>
+            <w:tcMar>
+              <w:top w:type="dxa" w:w="50"/>
+              <w:left w:type="dxa" w:w="90"/>
+              <w:bottom w:type="dxa" w:w="50"/>
+              <w:right w:type="dxa" w:w="90"/>
+            </w:tcMar>
+            <w:vAlign w:val="center"/>
+          </w:tcPr>
+          <w:p>
+            <w:pPr>
+              <w:spacing w:after="0"/>
+            </w:pPr>
+            <w:r>
+              <w:rPr>
+                <w:rFonts w:ascii="Calibri" w:cs="Calibri" w:eastAsia="Calibri" w:hAnsi="Calibri"/>
+                <w:sz w:val="17"/>
+                <w:szCs w:val="17"/>
+              </w:rPr>
+              <w:t xml:space="preserve">MB AxisPro Consulting</w:t>
+            </w:r>
+          </w:p>
+        </w:tc>
+      </w:tr>
+      <w:tr>
+        <w:tc>
+          <w:tcPr>
+            <w:tcW w:type="dxa" w:w="1748"/>
+            <w:tcBorders>
+              <w:top w:val="single" w:color="C9CFD8" w:sz="4"/>
+              <w:left w:val="single" w:color="C9CFD8" w:sz="4"/>
+              <w:bottom w:val="single" w:color="C9CFD8" w:sz="4"/>
+              <w:right w:val="single" w:color="C9CFD8" w:sz="4"/>
+            </w:tcBorders>
+            <w:tcMar>
+              <w:top w:type="dxa" w:w="50"/>
+              <w:left w:type="dxa" w:w="90"/>
+              <w:bottom w:type="dxa" w:w="50"/>
+              <w:right w:type="dxa" w:w="90"/>
+            </w:tcMar>
+            <w:vAlign w:val="center"/>
+          </w:tcPr>
+          <w:p>
+            <w:pPr>
+              <w:spacing w:after="0"/>
+            </w:pPr>
+            <w:r>
+              <w:rPr>
+                <w:rFonts w:ascii="Calibri" w:cs="Calibri" w:eastAsia="Calibri" w:hAnsi="Calibri"/>
+                <w:sz w:val="17"/>
+                <w:szCs w:val="17"/>
+              </w:rPr>
+              <w:t xml:space="preserve">test.rh</w:t>
+            </w:r>
+          </w:p>
+        </w:tc>
+        <w:tc>
+          <w:tcPr>
+            <w:tcW w:type="dxa" w:w="2906"/>
+            <w:tcBorders>
+              <w:top w:val="single" w:color="C9CFD8" w:sz="4"/>
+              <w:left w:val="single" w:color="C9CFD8" w:sz="4"/>
+              <w:bottom w:val="single" w:color="C9CFD8" w:sz="4"/>
+              <w:right w:val="single" w:color="C9CFD8" w:sz="4"/>
+            </w:tcBorders>
+            <w:tcMar>
+              <w:top w:type="dxa" w:w="50"/>
+              <w:left w:type="dxa" w:w="90"/>
+              <w:bottom w:type="dxa" w:w="50"/>
+              <w:right w:type="dxa" w:w="90"/>
+            </w:tcMar>
+            <w:vAlign w:val="center"/>
+          </w:tcPr>
+          <w:p>
+            <w:pPr>
+              <w:spacing w:after="0"/>
+            </w:pPr>
+            <w:r>
+              <w:rPr>
+                <w:rFonts w:ascii="Calibri" w:cs="Calibri" w:eastAsia="Calibri" w:hAnsi="Calibri"/>
+                <w:sz w:val="17"/>
+                <w:szCs w:val="17"/>
+              </w:rPr>
+              <w:t xml:space="preserve">Gestionnaire RH</w:t>
+            </w:r>
+          </w:p>
+        </w:tc>
+        <w:tc>
+          <w:tcPr>
+            <w:tcW w:type="dxa" w:w="3082"/>
+            <w:tcBorders>
+              <w:top w:val="single" w:color="C9CFD8" w:sz="4"/>
+              <w:left w:val="single" w:color="C9CFD8" w:sz="4"/>
+              <w:bottom w:val="single" w:color="C9CFD8" w:sz="4"/>
+              <w:right w:val="single" w:color="C9CFD8" w:sz="4"/>
+            </w:tcBorders>
+            <w:tcMar>
+              <w:top w:type="dxa" w:w="50"/>
+              <w:left w:type="dxa" w:w="90"/>
+              <w:bottom w:type="dxa" w:w="50"/>
+              <w:right w:type="dxa" w:w="90"/>
+            </w:tcMar>
+            <w:vAlign w:val="center"/>
+          </w:tcPr>
+          <w:p>
+            <w:pPr>
+              <w:spacing w:after="0"/>
+            </w:pPr>
+            <w:r>
+              <w:rPr>
+                <w:rFonts w:ascii="Calibri" w:cs="Calibri" w:eastAsia="Calibri" w:hAnsi="Calibri"/>
+                <w:sz w:val="17"/>
+                <w:szCs w:val="17"/>
+              </w:rPr>
+              <w:t xml:space="preserve">RH</w:t>
+            </w:r>
+          </w:p>
+        </w:tc>
+        <w:tc>
+          <w:tcPr>
+            <w:tcW w:type="dxa" w:w="1903"/>
+            <w:tcBorders>
+              <w:top w:val="single" w:color="C9CFD8" w:sz="4"/>
+              <w:left w:val="single" w:color="C9CFD8" w:sz="4"/>
+              <w:bottom w:val="single" w:color="C9CFD8" w:sz="4"/>
+              <w:right w:val="single" w:color="C9CFD8" w:sz="4"/>
+            </w:tcBorders>
+            <w:tcMar>
+              <w:top w:type="dxa" w:w="50"/>
+              <w:left w:type="dxa" w:w="90"/>
+              <w:bottom w:type="dxa" w:w="50"/>
+              <w:right w:type="dxa" w:w="90"/>
+            </w:tcMar>
+            <w:vAlign w:val="center"/>
+          </w:tcPr>
+          <w:p>
+            <w:pPr>
+              <w:spacing w:after="0"/>
+            </w:pPr>
+            <w:r>
+              <w:rPr>
+                <w:rFonts w:ascii="Calibri" w:cs="Calibri" w:eastAsia="Calibri" w:hAnsi="Calibri"/>
+                <w:sz w:val="17"/>
+                <w:szCs w:val="17"/>
+              </w:rPr>
+              <w:t xml:space="preserve">Les deux</w:t>
+            </w:r>
+          </w:p>
+        </w:tc>
+      </w:tr>
+      <w:tr>
+        <w:tc>
+          <w:tcPr>
+            <w:tcW w:type="dxa" w:w="1748"/>
+            <w:tcBorders>
+              <w:top w:val="single" w:color="C9CFD8" w:sz="4"/>
+              <w:left w:val="single" w:color="C9CFD8" w:sz="4"/>
+              <w:bottom w:val="single" w:color="C9CFD8" w:sz="4"/>
+              <w:right w:val="single" w:color="C9CFD8" w:sz="4"/>
+            </w:tcBorders>
+            <w:shd w:fill="F2F4F7" w:color="auto" w:val="clear"/>
+            <w:tcMar>
+              <w:top w:type="dxa" w:w="50"/>
+              <w:left w:type="dxa" w:w="90"/>
+              <w:bottom w:type="dxa" w:w="50"/>
+              <w:right w:type="dxa" w:w="90"/>
+            </w:tcMar>
+            <w:vAlign w:val="center"/>
+          </w:tcPr>
+          <w:p>
+            <w:pPr>
+              <w:spacing w:after="0"/>
+            </w:pPr>
+            <w:r>
+              <w:rPr>
+                <w:rFonts w:ascii="Calibri" w:cs="Calibri" w:eastAsia="Calibri" w:hAnsi="Calibri"/>
+                <w:sz w:val="17"/>
+                <w:szCs w:val="17"/>
+              </w:rPr>
+              <w:t xml:space="preserve">test.salarie</w:t>
+            </w:r>
+          </w:p>
+        </w:tc>
+        <w:tc>
+          <w:tcPr>
+            <w:tcW w:type="dxa" w:w="2906"/>
+            <w:tcBorders>
+              <w:top w:val="single" w:color="C9CFD8" w:sz="4"/>
+              <w:left w:val="single" w:color="C9CFD8" w:sz="4"/>
+              <w:bottom w:val="single" w:color="C9CFD8" w:sz="4"/>
+              <w:right w:val="single" w:color="C9CFD8" w:sz="4"/>
+            </w:tcBorders>
+            <w:shd w:fill="F2F4F7" w:color="auto" w:val="clear"/>
+            <w:tcMar>
+              <w:top w:type="dxa" w:w="50"/>
+              <w:left w:type="dxa" w:w="90"/>
+              <w:bottom w:type="dxa" w:w="50"/>
+              <w:right w:type="dxa" w:w="90"/>
+            </w:tcMar>
+            <w:vAlign w:val="center"/>
+          </w:tcPr>
+          <w:p>
+            <w:pPr>
+              <w:spacing w:after="0"/>
+            </w:pPr>
+            <w:r>
+              <w:rPr>
+                <w:rFonts w:ascii="Calibri" w:cs="Calibri" w:eastAsia="Calibri" w:hAnsi="Calibri"/>
+                <w:sz w:val="17"/>
+                <w:szCs w:val="17"/>
+              </w:rPr>
+              <w:t xml:space="preserve">Salarié</w:t>
+            </w:r>
+          </w:p>
+        </w:tc>
+        <w:tc>
+          <w:tcPr>
+            <w:tcW w:type="dxa" w:w="3082"/>
+            <w:tcBorders>
+              <w:top w:val="single" w:color="C9CFD8" w:sz="4"/>
+              <w:left w:val="single" w:color="C9CFD8" w:sz="4"/>
+              <w:bottom w:val="single" w:color="C9CFD8" w:sz="4"/>
+              <w:right w:val="single" w:color="C9CFD8" w:sz="4"/>
+            </w:tcBorders>
+            <w:shd w:fill="F2F4F7" w:color="auto" w:val="clear"/>
+            <w:tcMar>
+              <w:top w:type="dxa" w:w="50"/>
+              <w:left w:type="dxa" w:w="90"/>
+              <w:bottom w:type="dxa" w:w="50"/>
+              <w:right w:type="dxa" w:w="90"/>
+            </w:tcMar>
+            <w:vAlign w:val="center"/>
+          </w:tcPr>
+          <w:p>
+            <w:pPr>
+              <w:spacing w:after="0"/>
+            </w:pPr>
+            <w:r>
+              <w:rPr>
+                <w:rFonts w:ascii="Calibri" w:cs="Calibri" w:eastAsia="Calibri" w:hAnsi="Calibri"/>
+                <w:sz w:val="17"/>
+                <w:szCs w:val="17"/>
+              </w:rPr>
+              <w:t xml:space="preserve">RH, « Mon espace » seul</w:t>
+            </w:r>
+          </w:p>
+        </w:tc>
+        <w:tc>
+          <w:tcPr>
+            <w:tcW w:type="dxa" w:w="1903"/>
+            <w:tcBorders>
+              <w:top w:val="single" w:color="C9CFD8" w:sz="4"/>
+              <w:left w:val="single" w:color="C9CFD8" w:sz="4"/>
+              <w:bottom w:val="single" w:color="C9CFD8" w:sz="4"/>
+              <w:right w:val="single" w:color="C9CFD8" w:sz="4"/>
+            </w:tcBorders>
+            <w:shd w:fill="F2F4F7" w:color="auto" w:val="clear"/>
+            <w:tcMar>
+              <w:top w:type="dxa" w:w="50"/>
+              <w:left w:type="dxa" w:w="90"/>
+              <w:bottom w:type="dxa" w:w="50"/>
+              <w:right w:type="dxa" w:w="90"/>
+            </w:tcMar>
+            <w:vAlign w:val="center"/>
+          </w:tcPr>
+          <w:p>
+            <w:pPr>
+              <w:spacing w:after="0"/>
+            </w:pPr>
+            <w:r>
+              <w:rPr>
+                <w:rFonts w:ascii="Calibri" w:cs="Calibri" w:eastAsia="Calibri" w:hAnsi="Calibri"/>
+                <w:sz w:val="17"/>
+                <w:szCs w:val="17"/>
+              </w:rPr>
+              <w:t xml:space="preserve">EGUITRA GROUP</w:t>
+            </w:r>
+          </w:p>
+        </w:tc>
+      </w:tr>
+      <w:tr>
+        <w:tc>
+          <w:tcPr>
+            <w:tcW w:type="dxa" w:w="1748"/>
+            <w:tcBorders>
+              <w:top w:val="single" w:color="C9CFD8" w:sz="4"/>
+              <w:left w:val="single" w:color="C9CFD8" w:sz="4"/>
+              <w:bottom w:val="single" w:color="C9CFD8" w:sz="4"/>
+              <w:right w:val="single" w:color="C9CFD8" w:sz="4"/>
+            </w:tcBorders>
+            <w:tcMar>
+              <w:top w:type="dxa" w:w="50"/>
+              <w:left w:type="dxa" w:w="90"/>
+              <w:bottom w:type="dxa" w:w="50"/>
+              <w:right w:type="dxa" w:w="90"/>
+            </w:tcMar>
+            <w:vAlign w:val="center"/>
+          </w:tcPr>
+          <w:p>
+            <w:pPr>
+              <w:spacing w:after="0"/>
+            </w:pPr>
+            <w:r>
+              <w:rPr>
+                <w:rFonts w:ascii="Calibri" w:cs="Calibri" w:eastAsia="Calibri" w:hAnsi="Calibri"/>
+                <w:sz w:val="17"/>
+                <w:szCs w:val="17"/>
+              </w:rPr>
+              <w:t xml:space="preserve">test.admin</w:t>
+            </w:r>
+          </w:p>
+        </w:tc>
+        <w:tc>
+          <w:tcPr>
+            <w:tcW w:type="dxa" w:w="2906"/>
+            <w:tcBorders>
+              <w:top w:val="single" w:color="C9CFD8" w:sz="4"/>
+              <w:left w:val="single" w:color="C9CFD8" w:sz="4"/>
+              <w:bottom w:val="single" w:color="C9CFD8" w:sz="4"/>
+              <w:right w:val="single" w:color="C9CFD8" w:sz="4"/>
+            </w:tcBorders>
+            <w:tcMar>
+              <w:top w:type="dxa" w:w="50"/>
+              <w:left w:type="dxa" w:w="90"/>
+              <w:bottom w:type="dxa" w:w="50"/>
+              <w:right w:type="dxa" w:w="90"/>
+            </w:tcMar>
+            <w:vAlign w:val="center"/>
+          </w:tcPr>
+          <w:p>
+            <w:pPr>
+              <w:spacing w:after="0"/>
+            </w:pPr>
+            <w:r>
+              <w:rPr>
+                <w:rFonts w:ascii="Calibri" w:cs="Calibri" w:eastAsia="Calibri" w:hAnsi="Calibri"/>
+                <w:sz w:val="17"/>
+                <w:szCs w:val="17"/>
+              </w:rPr>
+              <w:t xml:space="preserve">Administrateur</w:t>
+            </w:r>
+          </w:p>
+        </w:tc>
+        <w:tc>
+          <w:tcPr>
+            <w:tcW w:type="dxa" w:w="3082"/>
+            <w:tcBorders>
+              <w:top w:val="single" w:color="C9CFD8" w:sz="4"/>
+              <w:left w:val="single" w:color="C9CFD8" w:sz="4"/>
+              <w:bottom w:val="single" w:color="C9CFD8" w:sz="4"/>
+              <w:right w:val="single" w:color="C9CFD8" w:sz="4"/>
+            </w:tcBorders>
+            <w:tcMar>
+              <w:top w:type="dxa" w:w="50"/>
+              <w:left w:type="dxa" w:w="90"/>
+              <w:bottom w:type="dxa" w:w="50"/>
+              <w:right w:type="dxa" w:w="90"/>
+            </w:tcMar>
+            <w:vAlign w:val="center"/>
+          </w:tcPr>
+          <w:p>
+            <w:pPr>
+              <w:spacing w:after="0"/>
+            </w:pPr>
+            <w:r>
+              <w:rPr>
+                <w:rFonts w:ascii="Calibri" w:cs="Calibri" w:eastAsia="Calibri" w:hAnsi="Calibri"/>
+                <w:sz w:val="17"/>
+                <w:szCs w:val="17"/>
+              </w:rPr>
+              <w:t xml:space="preserve">Toutes</w:t>
+            </w:r>
+          </w:p>
+        </w:tc>
+        <w:tc>
+          <w:tcPr>
+            <w:tcW w:type="dxa" w:w="1903"/>
+            <w:tcBorders>
+              <w:top w:val="single" w:color="C9CFD8" w:sz="4"/>
+              <w:left w:val="single" w:color="C9CFD8" w:sz="4"/>
+              <w:bottom w:val="single" w:color="C9CFD8" w:sz="4"/>
+              <w:right w:val="single" w:color="C9CFD8" w:sz="4"/>
+            </w:tcBorders>
+            <w:tcMar>
+              <w:top w:type="dxa" w:w="50"/>
+              <w:left w:type="dxa" w:w="90"/>
+              <w:bottom w:type="dxa" w:w="50"/>
+              <w:right w:type="dxa" w:w="90"/>
+            </w:tcMar>
+            <w:vAlign w:val="center"/>
+          </w:tcPr>
+          <w:p>
+            <w:pPr>
+              <w:spacing w:after="0"/>
+            </w:pPr>
+            <w:r>
+              <w:rPr>
+                <w:rFonts w:ascii="Calibri" w:cs="Calibri" w:eastAsia="Calibri" w:hAnsi="Calibri"/>
+                <w:sz w:val="17"/>
+                <w:szCs w:val="17"/>
+              </w:rPr>
+              <w:t xml:space="preserve">Les deux</w:t>
+            </w:r>
+          </w:p>
+        </w:tc>
+      </w:tr>
+      <w:tr>
+        <w:tc>
+          <w:tcPr>
+            <w:tcW w:type="dxa" w:w="1748"/>
+            <w:tcBorders>
+              <w:top w:val="single" w:color="C9CFD8" w:sz="4"/>
+              <w:left w:val="single" w:color="C9CFD8" w:sz="4"/>
+              <w:bottom w:val="single" w:color="C9CFD8" w:sz="4"/>
+              <w:right w:val="single" w:color="C9CFD8" w:sz="4"/>
+            </w:tcBorders>
+            <w:shd w:fill="F2F4F7" w:color="auto" w:val="clear"/>
+            <w:tcMar>
+              <w:top w:type="dxa" w:w="50"/>
+              <w:left w:type="dxa" w:w="90"/>
+              <w:bottom w:type="dxa" w:w="50"/>
+              <w:right w:type="dxa" w:w="90"/>
+            </w:tcMar>
+            <w:vAlign w:val="center"/>
+          </w:tcPr>
+          <w:p>
+            <w:pPr>
+              <w:spacing w:after="0"/>
+            </w:pPr>
+            <w:r>
+              <w:rPr>
+                <w:rFonts w:ascii="Calibri" w:cs="Calibri" w:eastAsia="Calibri" w:hAnsi="Calibri"/>
+                <w:sz w:val="17"/>
+                <w:szCs w:val="17"/>
+              </w:rPr>
               <w:t xml:space="preserve">test.porteur</w:t>
             </w:r>
           </w:p>
         </w:tc>
         <w:tc>
           <w:tcPr>
-            <w:tcW w:type="dxa" w:w="3309"/>
+            <w:tcW w:type="dxa" w:w="2906"/>
             <w:tcBorders>
               <w:top w:val="single" w:color="C9CFD8" w:sz="4"/>
               <w:left w:val="single" w:color="C9CFD8" w:sz="4"/>
@@ -2341,7 +3676,7 @@
         </w:tc>
         <w:tc>
           <w:tcPr>
-            <w:tcW w:type="dxa" w:w="2684"/>
+            <w:tcW w:type="dxa" w:w="3082"/>
             <w:tcBorders>
               <w:top w:val="single" w:color="C9CFD8" w:sz="4"/>
               <w:left w:val="single" w:color="C9CFD8" w:sz="4"/>
@@ -2373,7 +3708,7 @@
         </w:tc>
         <w:tc>
           <w:tcPr>
-            <w:tcW w:type="dxa" w:w="1708"/>
+            <w:tcW w:type="dxa" w:w="1903"/>
             <w:tcBorders>
               <w:top w:val="single" w:color="C9CFD8" w:sz="4"/>
               <w:left w:val="single" w:color="C9CFD8" w:sz="4"/>
@@ -2399,7 +3734,7 @@
                 <w:sz w:val="17"/>
                 <w:szCs w:val="17"/>
               </w:rPr>
-              <w:t xml:space="preserve">MB AxisPro</w:t>
+              <w:t xml:space="preserve">MB AxisPro Consulting</w:t>
             </w:r>
           </w:p>
         </w:tc>
@@ -2716,7 +4051,7 @@
           <w:sz w:val="20"/>
           <w:szCs w:val="20"/>
         </w:rPr>
-        <w:t xml:space="preserve">Changer de société (colonne de gauche) : vérifiez que les chiffres, les factures et les journaux d'EGUITRA GROUP et de MB AxisPro restent bien séparés.</w:t>
+        <w:t xml:space="preserve">Changer de société (nom de la société, en haut à droite) : vérifiez que les chiffres, les factures et les journaux d'EGUITRA GROUP et de MB AxisPro Consulting restent bien séparés.</w:t>
       </w:r>
     </w:p>
     <w:p>
@@ -3033,7 +4368,7 @@
           <w:sz w:val="20"/>
           <w:szCs w:val="20"/>
         </w:rPr>
-        <w:t xml:space="preserve">Administration &gt; Utilisateurs : créer un compte, lui donner un profil et une société ; vérifier qu'un profil d'EGUITRA ne peut pas être ouvert sur MB AxisPro seule, et inversement.</w:t>
+        <w:t xml:space="preserve">Administration &gt; Utilisateurs : créer un compte, lui donner un profil et une société ; vérifier qu'un profil d'EGUITRA ne peut pas être ouvert sur MB AxisPro Consulting seule, et inversement.</w:t>
       </w:r>
     </w:p>
     <w:p>

</xml_diff>